<commit_message>
Update Bremer Stadtmusikanten EN - Copy.docx
</commit_message>
<xml_diff>
--- a/Bremer Stadtmusikanten EN - Copy.docx
+++ b/Bremer Stadtmusikanten EN - Copy.docx
@@ -304,7 +304,15 @@
     </w:p>
     <w:p>
       <w:r>
-        <w:t xml:space="preserve">“ Well, i’ll leave you be </w:t>
+        <w:t xml:space="preserve">“ Well, </w:t>
+      </w:r>
+      <w:proofErr w:type="spellStart"/>
+      <w:r>
+        <w:t>i’ll</w:t>
+      </w:r>
+      <w:proofErr w:type="spellEnd"/>
+      <w:r>
+        <w:t xml:space="preserve"> leave you be </w:t>
       </w:r>
       <w:r>
         <w:t xml:space="preserve">to rest. I am off to become a musician!” Said the donkey and happily galloped away, leaving the dog </w:t>
@@ -328,6 +336,7 @@
           <w:b/>
           <w:bCs/>
         </w:rPr>
+        <w:lastRenderedPageBreak/>
         <w:t>Option 3 Continuation:</w:t>
       </w:r>
     </w:p>
@@ -543,13 +552,7 @@
         <w:rPr>
           <w:highlight w:val="yellow"/>
         </w:rPr>
-        <w:t>us</w:t>
-      </w:r>
-      <w:r>
-        <w:rPr>
-          <w:highlight w:val="yellow"/>
-        </w:rPr>
-        <w:t>/me</w:t>
+        <w:t>us/me</w:t>
       </w:r>
       <w:r>
         <w:t xml:space="preserve"> to Bremen. After all, you understand night music. You can become a town musician there</w:t>
@@ -561,10 +564,16 @@
         <w:t>"</w:t>
       </w:r>
       <w:r>
-        <w:t xml:space="preserve"> The donkey described. </w:t>
-      </w:r>
-      <w:r>
-        <w:t>The cat agreed and went along.</w:t>
+        <w:t xml:space="preserve"> The donkey and dog both described. </w:t>
+      </w:r>
+      <w:r>
+        <w:t xml:space="preserve">The cat </w:t>
+      </w:r>
+      <w:r>
+        <w:t>was convinced by both the donkey and dog</w:t>
+      </w:r>
+      <w:r>
+        <w:t xml:space="preserve"> and went along.</w:t>
       </w:r>
     </w:p>
     <w:p>
@@ -641,7 +650,15 @@
         <w:t>us/me</w:t>
       </w:r>
       <w:r>
-        <w:t xml:space="preserve"> to Bremen, its better than staying here and waiting for your demise.” The donkey spouted. The cat was baffled by the mean words, they were true but mean. With a big huff and puff the cat decided </w:t>
+        <w:t xml:space="preserve"> to Bremen, </w:t>
+      </w:r>
+      <w:proofErr w:type="spellStart"/>
+      <w:r>
+        <w:t>its</w:t>
+      </w:r>
+      <w:proofErr w:type="spellEnd"/>
+      <w:r>
+        <w:t xml:space="preserve"> better than staying here and waiting for your demise.” The donkey spouted. The cat was baffled by the mean words, they were true but mean. With a big huff and puff the cat decided </w:t>
       </w:r>
       <w:r>
         <w:t>to turn around and sleep</w:t>
@@ -729,6 +746,7 @@
           <w:b/>
           <w:bCs/>
         </w:rPr>
+        <w:lastRenderedPageBreak/>
         <w:t>Continuation of the options:</w:t>
       </w:r>
     </w:p>
@@ -852,7 +870,15 @@
         <w:t>“</w:t>
       </w:r>
       <w:r>
-        <w:t xml:space="preserve"> Hey now my fellow friend! That sounds tragic! My party and me are headed of to the city to become musicians! Why not join us and amaze the crowds with your beautiful voice?” Said the donkey excitedly. </w:t>
+        <w:t xml:space="preserve"> Hey now my fellow friend! That sounds tragic! My party and me are headed </w:t>
+      </w:r>
+      <w:proofErr w:type="spellStart"/>
+      <w:r>
+        <w:t>of</w:t>
+      </w:r>
+      <w:proofErr w:type="spellEnd"/>
+      <w:r>
+        <w:t xml:space="preserve"> to the city to become musicians! Why not join us and amaze the crowds with your beautiful voice?” Said the donkey excitedly. </w:t>
       </w:r>
       <w:r>
         <w:t>The rooster was happy with the proposal, and all four went off together.</w:t>
@@ -1103,7 +1129,11 @@
     </w:p>
     <w:p>
       <w:r>
-        <w:t xml:space="preserve">Before falling asleep he looked around once again in all four directions, and he thought that he saw a little spark burning in the distance. The donkey went and had a look inside the house, seeing robbers the donkey did not dare fight them alone. </w:t>
+        <w:t xml:space="preserve">Before falling asleep he looked around once again in all four directions, and he thought that he saw a little spark burning in the distance. The donkey went and had a look inside </w:t>
+      </w:r>
+      <w:r>
+        <w:lastRenderedPageBreak/>
+        <w:t xml:space="preserve">the house, seeing robbers the donkey did not dare fight them alone. </w:t>
       </w:r>
       <w:r>
         <w:t>Carrying</w:t>
@@ -1260,6 +1290,7 @@
     <w:p/>
     <w:p>
       <w:r>
+        <w:lastRenderedPageBreak/>
         <w:t xml:space="preserve">The robbers jumped up at the terrible bellowing, thinking that a ghost was coming in, and fled in great fear out into the woods. Then the </w:t>
       </w:r>
       <w:r>
@@ -1431,6 +1462,7 @@
           <w:b/>
           <w:bCs/>
         </w:rPr>
+        <w:lastRenderedPageBreak/>
         <w:t>___________</w:t>
       </w:r>
       <w:r>
@@ -1694,6 +1726,7 @@
     </w:p>
     <w:p>
       <w:r>
+        <w:lastRenderedPageBreak/>
         <w:t>When midnight had passed and the robbers saw from the distance that the light was no longer burning in the house, and everything appeared to be quiet, the captain said, "We shouldn't have let ourselves be chased off," and he told one of them to go back and investigate the house. The one they sent found everything still and went into the kitchen to strike a light.</w:t>
       </w:r>
     </w:p>

</xml_diff>

<commit_message>
corrected story inconsistencies in word file
</commit_message>
<xml_diff>
--- a/Bremer Stadtmusikanten EN - Copy.docx
+++ b/Bremer Stadtmusikanten EN - Copy.docx
@@ -546,7 +546,75 @@
     </w:p>
     <w:p>
       <w:r>
-        <w:t xml:space="preserve">"Come with </w:t>
+        <w:t>“Come along to Bremen! After all, you understand night music. You can become a town musician there and help draw an audience!” said the donkey excitedly. The cat was surprised by the cheerful invitation, but the thought of becoming a musician sounded much better than sitting alone and afraid. Convinced, the cat joined the donkey on his journey.</w:t>
+      </w:r>
+    </w:p>
+    <w:p>
+      <w:pPr>
+        <w:rPr>
+          <w:b/>
+          <w:bCs/>
+        </w:rPr>
+      </w:pPr>
+      <w:r>
+        <w:rPr>
+          <w:b/>
+          <w:bCs/>
+        </w:rPr>
+        <w:t>Option 2</w:t>
+      </w:r>
+      <w:r>
+        <w:rPr>
+          <w:b/>
+          <w:bCs/>
+        </w:rPr>
+        <w:t>.</w:t>
+      </w:r>
+      <w:r>
+        <w:rPr>
+          <w:b/>
+          <w:bCs/>
+        </w:rPr>
+        <w:t>2</w:t>
+      </w:r>
+      <w:r>
+        <w:rPr>
+          <w:b/>
+          <w:bCs/>
+        </w:rPr>
+        <w:t xml:space="preserve"> (neutral): </w:t>
+      </w:r>
+      <w:r>
+        <w:rPr>
+          <w:b/>
+          <w:bCs/>
+        </w:rPr>
+        <w:t>(</w:t>
+      </w:r>
+      <w:r>
+        <w:rPr>
+          <w:b/>
+          <w:bCs/>
+        </w:rPr>
+        <w:t>No companion gained</w:t>
+      </w:r>
+      <w:r>
+        <w:rPr>
+          <w:b/>
+          <w:bCs/>
+        </w:rPr>
+        <w:t>)</w:t>
+      </w:r>
+    </w:p>
+    <w:p>
+      <w:r>
+        <w:t>“</w:t>
+      </w:r>
+      <w:r>
+        <w:t xml:space="preserve"> Wouldn’t it be better to have one last hurray? In your old age.</w:t>
+      </w:r>
+      <w:r>
+        <w:t xml:space="preserve"> Come with </w:t>
       </w:r>
       <w:r>
         <w:rPr>
@@ -555,47 +623,39 @@
         <w:t>us/me</w:t>
       </w:r>
       <w:r>
-        <w:t xml:space="preserve"> to Bremen. After all, you understand night music. You can become a town musician there</w:t>
-      </w:r>
-      <w:r>
-        <w:t xml:space="preserve"> and help us gain an audience!</w:t>
-      </w:r>
-      <w:r>
-        <w:t>"</w:t>
-      </w:r>
-      <w:r>
-        <w:t xml:space="preserve"> The donkey and dog both described. </w:t>
-      </w:r>
-      <w:r>
-        <w:t xml:space="preserve">The cat </w:t>
-      </w:r>
-      <w:r>
-        <w:t>was convinced by both the donkey and dog</w:t>
-      </w:r>
-      <w:r>
-        <w:t xml:space="preserve"> and went along.</w:t>
-      </w:r>
-    </w:p>
-    <w:p>
-      <w:pPr>
-        <w:rPr>
-          <w:b/>
-          <w:bCs/>
-        </w:rPr>
-      </w:pPr>
-      <w:r>
-        <w:rPr>
-          <w:b/>
-          <w:bCs/>
-        </w:rPr>
-        <w:t>Option 2</w:t>
-      </w:r>
-      <w:r>
-        <w:rPr>
-          <w:b/>
-          <w:bCs/>
-        </w:rPr>
-        <w:t>.</w:t>
+        <w:t xml:space="preserve"> to Bremen, </w:t>
+      </w:r>
+      <w:proofErr w:type="spellStart"/>
+      <w:r>
+        <w:t>its</w:t>
+      </w:r>
+      <w:proofErr w:type="spellEnd"/>
+      <w:r>
+        <w:t xml:space="preserve"> better than staying here and waiting for your demise.” The donkey spouted. The cat was baffled by the mean words, they were true but mean. With a big huff and puff the cat decided </w:t>
+      </w:r>
+      <w:r>
+        <w:t>to turn around and sleep</w:t>
+      </w:r>
+      <w:r>
+        <w:t xml:space="preserve"> declining the offer</w:t>
+      </w:r>
+      <w:r>
+        <w:t xml:space="preserve">. </w:t>
+      </w:r>
+    </w:p>
+    <w:p>
+      <w:pPr>
+        <w:rPr>
+          <w:b/>
+          <w:bCs/>
+        </w:rPr>
+      </w:pPr>
+      <w:r>
+        <w:rPr>
+          <w:b/>
+          <w:bCs/>
+        </w:rPr>
+        <w:t>Option 3.</w:t>
       </w:r>
       <w:r>
         <w:rPr>
@@ -609,7 +669,148 @@
           <w:b/>
           <w:bCs/>
         </w:rPr>
-        <w:t xml:space="preserve"> (neutral): </w:t>
+        <w:t xml:space="preserve"> (Bad):</w:t>
+      </w:r>
+      <w:r>
+        <w:rPr>
+          <w:b/>
+          <w:bCs/>
+        </w:rPr>
+        <w:t xml:space="preserve"> (No companion joined donkey party in this option)</w:t>
+      </w:r>
+    </w:p>
+    <w:p>
+      <w:r>
+        <w:t xml:space="preserve">“Well you seem to be aging alright, </w:t>
+      </w:r>
+      <w:r>
+        <w:t xml:space="preserve">I wanted to invite you to join </w:t>
+      </w:r>
+      <w:r>
+        <w:rPr>
+          <w:highlight w:val="yellow"/>
+        </w:rPr>
+        <w:t>us/me</w:t>
+      </w:r>
+      <w:r>
+        <w:t xml:space="preserve"> in our adventure to be musicians but clearly you can’t use your </w:t>
+      </w:r>
+      <w:r>
+        <w:t>muscles like you used to...” The donkey said in a joking manner, trying to get laughs but instead was met with a hiss from the cat so shrill and lethal</w:t>
+      </w:r>
+      <w:r>
+        <w:t>,</w:t>
+      </w:r>
+      <w:r>
+        <w:t xml:space="preserve"> it made the donkey flee and run along the path, far away from the cat. </w:t>
+      </w:r>
+    </w:p>
+    <w:p/>
+    <w:p>
+      <w:pPr>
+        <w:rPr>
+          <w:b/>
+          <w:bCs/>
+        </w:rPr>
+      </w:pPr>
+      <w:r>
+        <w:rPr>
+          <w:b/>
+          <w:bCs/>
+        </w:rPr>
+        <w:lastRenderedPageBreak/>
+        <w:t>Continuation of the options:</w:t>
+      </w:r>
+    </w:p>
+    <w:p>
+      <w:r>
+        <w:t xml:space="preserve">After travelling further along the road, the donkey and </w:t>
+      </w:r>
+      <w:r>
+        <w:t>their</w:t>
+      </w:r>
+      <w:r>
+        <w:t xml:space="preserve"> companion came to a farmyard. They were tired from the day’s journey, but the donkey felt less alone with every new friend who had walked beside him. There, the rooster of the house was sitting on the gate, crying with all his might.</w:t>
+      </w:r>
+    </w:p>
+    <w:p>
+      <w:r>
+        <w:t>“Your cries pierce one’s marrow and bone,” said the donkey. “What are you up to?”</w:t>
+      </w:r>
+    </w:p>
+    <w:p>
+      <w:r>
+        <w:t>“I just prophesied good weather,” said the rooster, “because it is Our Dear Lady’s Day, when she washes the Christ Child’s shirts and wants to dry them; but because Sunday guests are coming tomorrow, the lady of the house has no mercy and told the cook that she wants to eat me tomorrow in the soup, so I am supposed to let them cut off my head this evening. Now I am going to cry at the top of my voice as long as I can.”</w:t>
+      </w:r>
+    </w:p>
+    <w:p>
+      <w:pPr>
+        <w:rPr>
+          <w:b/>
+          <w:bCs/>
+        </w:rPr>
+      </w:pPr>
+      <w:r>
+        <w:rPr>
+          <w:b/>
+          <w:bCs/>
+        </w:rPr>
+        <w:t>Option 1.3 (Good):</w:t>
+      </w:r>
+      <w:r>
+        <w:rPr>
+          <w:b/>
+          <w:bCs/>
+        </w:rPr>
+        <w:t xml:space="preserve"> (Companion gained)</w:t>
+      </w:r>
+    </w:p>
+    <w:p>
+      <w:r>
+        <w:t>“</w:t>
+      </w:r>
+      <w:r>
+        <w:t xml:space="preserve"> Hey now my fellow friend! That sounds tragic! My party and me are headed </w:t>
+      </w:r>
+      <w:proofErr w:type="spellStart"/>
+      <w:r>
+        <w:t>of</w:t>
+      </w:r>
+      <w:proofErr w:type="spellEnd"/>
+      <w:r>
+        <w:t xml:space="preserve"> to the city to become musicians! Why not join us and amaze the crowds with your beautiful voice?” Said the donkey excitedly. </w:t>
+      </w:r>
+      <w:r>
+        <w:t>The rooster was happy with the proposal, and all four went off together.</w:t>
+      </w:r>
+    </w:p>
+    <w:p>
+      <w:pPr>
+        <w:rPr>
+          <w:b/>
+          <w:bCs/>
+        </w:rPr>
+      </w:pPr>
+      <w:r>
+        <w:rPr>
+          <w:b/>
+          <w:bCs/>
+        </w:rPr>
+        <w:t xml:space="preserve">Option </w:t>
+      </w:r>
+      <w:r>
+        <w:rPr>
+          <w:b/>
+          <w:bCs/>
+        </w:rPr>
+        <w:t>2</w:t>
+      </w:r>
+      <w:r>
+        <w:rPr>
+          <w:b/>
+          <w:bCs/>
+        </w:rPr>
+        <w:t>.3</w:t>
       </w:r>
       <w:r>
         <w:rPr>
@@ -623,6 +824,74 @@
           <w:b/>
           <w:bCs/>
         </w:rPr>
+        <w:t>Neutral</w:t>
+      </w:r>
+      <w:r>
+        <w:rPr>
+          <w:b/>
+          <w:bCs/>
+        </w:rPr>
+        <w:t>)</w:t>
+      </w:r>
+      <w:r>
+        <w:rPr>
+          <w:b/>
+          <w:bCs/>
+        </w:rPr>
+        <w:t>:</w:t>
+      </w:r>
+      <w:r>
+        <w:rPr>
+          <w:b/>
+          <w:bCs/>
+        </w:rPr>
+        <w:t xml:space="preserve"> </w:t>
+      </w:r>
+      <w:r>
+        <w:rPr>
+          <w:b/>
+          <w:bCs/>
+        </w:rPr>
+        <w:t>(Companion gained)</w:t>
+      </w:r>
+    </w:p>
+    <w:p>
+      <w:r>
+        <w:t>"Hey now, Red-Head," said the donkey, "instead come away with us. We're going to Bremen. You can always find something better than death. You have a good voice, and when we make music together, it will be very pleasing."</w:t>
+      </w:r>
+      <w:r>
+        <w:t xml:space="preserve"> Mentioned the Donkey sheepishly. </w:t>
+      </w:r>
+      <w:r>
+        <w:t xml:space="preserve">The rooster was taken aback by the straight forwardness but agreed nonetheless. </w:t>
+      </w:r>
+    </w:p>
+    <w:p>
+      <w:pPr>
+        <w:rPr>
+          <w:b/>
+          <w:bCs/>
+        </w:rPr>
+      </w:pPr>
+      <w:r>
+        <w:rPr>
+          <w:b/>
+          <w:bCs/>
+        </w:rPr>
+        <w:t xml:space="preserve">Option 3.3(Bad): </w:t>
+      </w:r>
+      <w:r>
+        <w:rPr>
+          <w:b/>
+          <w:bCs/>
+        </w:rPr>
+        <w:t>(</w:t>
+      </w:r>
+      <w:r>
+        <w:rPr>
+          <w:b/>
+          <w:bCs/>
+        </w:rPr>
         <w:t>No companion gained</w:t>
       </w:r>
       <w:r>
@@ -635,105 +904,76 @@
     </w:p>
     <w:p>
       <w:r>
-        <w:t>“</w:t>
-      </w:r>
-      <w:r>
-        <w:t xml:space="preserve"> Wouldn’t it be better to have one last hurray? In your old age.</w:t>
-      </w:r>
-      <w:r>
-        <w:t xml:space="preserve"> Come with </w:t>
+        <w:t xml:space="preserve">“ Well that does sound bad but </w:t>
+      </w:r>
+      <w:r>
+        <w:t>with your shrill voice, do you believe you’ll make a difference if you make noises all evening long? Better come with us, might as well put your voice to good use</w:t>
+      </w:r>
+      <w:r>
+        <w:t xml:space="preserve">.” The donkey snorted. </w:t>
+      </w:r>
+      <w:r>
+        <w:t xml:space="preserve">The rooster was appalled and continued with the noise making, </w:t>
+      </w:r>
+      <w:r>
+        <w:t>being louder than before. The donkey lowered their head in shame and walked on</w:t>
+      </w:r>
+      <w:r>
+        <w:t xml:space="preserve"> towards the city</w:t>
+      </w:r>
+      <w:r>
+        <w:t>, regretting their choice of words.</w:t>
+      </w:r>
+    </w:p>
+    <w:p>
+      <w:pPr>
+        <w:rPr>
+          <w:b/>
+          <w:bCs/>
+        </w:rPr>
+      </w:pPr>
+      <w:r>
+        <w:rPr>
+          <w:b/>
+          <w:bCs/>
+        </w:rPr>
+        <w:t xml:space="preserve">Continuation from </w:t>
+      </w:r>
+      <w:r>
+        <w:rPr>
+          <w:b/>
+          <w:bCs/>
+        </w:rPr>
+        <w:t xml:space="preserve">all </w:t>
+      </w:r>
+      <w:r>
+        <w:rPr>
+          <w:b/>
+          <w:bCs/>
+        </w:rPr>
+        <w:t xml:space="preserve">options: </w:t>
+      </w:r>
+    </w:p>
+    <w:p>
+      <w:r>
+        <w:t xml:space="preserve">However, the donkey </w:t>
       </w:r>
       <w:r>
         <w:rPr>
           <w:highlight w:val="yellow"/>
         </w:rPr>
-        <w:t>us/me</w:t>
-      </w:r>
-      <w:r>
-        <w:t xml:space="preserve"> to Bremen, </w:t>
-      </w:r>
-      <w:proofErr w:type="spellStart"/>
-      <w:r>
-        <w:t>its</w:t>
-      </w:r>
-      <w:proofErr w:type="spellEnd"/>
-      <w:r>
-        <w:t xml:space="preserve"> better than staying here and waiting for your demise.” The donkey spouted. The cat was baffled by the mean words, they were true but mean. With a big huff and puff the cat decided </w:t>
-      </w:r>
-      <w:r>
-        <w:t>to turn around and sleep</w:t>
-      </w:r>
-      <w:r>
-        <w:t xml:space="preserve"> declining the offer</w:t>
+        <w:t>and his companions</w:t>
+      </w:r>
+      <w:r>
+        <w:t>, could not reach the city of Bremen in one day. In the evening, they came into a forest, where they decided to spend the night</w:t>
       </w:r>
       <w:r>
         <w:t xml:space="preserve">. </w:t>
-      </w:r>
-    </w:p>
-    <w:p>
-      <w:pPr>
-        <w:rPr>
-          <w:b/>
-          <w:bCs/>
-        </w:rPr>
-      </w:pPr>
-      <w:r>
-        <w:rPr>
-          <w:b/>
-          <w:bCs/>
-        </w:rPr>
-        <w:t>Option 3.</w:t>
-      </w:r>
-      <w:r>
-        <w:rPr>
-          <w:b/>
-          <w:bCs/>
-        </w:rPr>
-        <w:t>2</w:t>
-      </w:r>
-      <w:r>
-        <w:rPr>
-          <w:b/>
-          <w:bCs/>
-        </w:rPr>
-        <w:t xml:space="preserve"> (Bad):</w:t>
-      </w:r>
-      <w:r>
-        <w:rPr>
-          <w:b/>
-          <w:bCs/>
-        </w:rPr>
-        <w:t xml:space="preserve"> (No companion joined donkey party in this option)</w:t>
-      </w:r>
-    </w:p>
-    <w:p>
-      <w:r>
-        <w:t xml:space="preserve">“Well you seem to be aging alright, </w:t>
-      </w:r>
-      <w:r>
-        <w:t xml:space="preserve">I wanted to invite you to join </w:t>
-      </w:r>
-      <w:r>
-        <w:rPr>
-          <w:highlight w:val="yellow"/>
-        </w:rPr>
-        <w:t>us/me</w:t>
-      </w:r>
-      <w:r>
-        <w:t xml:space="preserve"> in our adventure to be musicians but clearly you can’t use your </w:t>
-      </w:r>
-      <w:r>
-        <w:t>muscles like you used to...” The donkey said in a joking manner, trying to get laughs but instead was met with a hiss from the cat so shrill and lethal</w:t>
-      </w:r>
-      <w:r>
-        <w:t>,</w:t>
-      </w:r>
-      <w:r>
-        <w:t xml:space="preserve"> it made the donkey flee and run along the path, far away from the cat. </w:t>
       </w:r>
     </w:p>
     <w:p/>
     <w:p/>
+    <w:p/>
     <w:p>
       <w:pPr>
         <w:rPr>
@@ -747,580 +987,213 @@
           <w:bCs/>
         </w:rPr>
         <w:lastRenderedPageBreak/>
-        <w:t>Continuation of the options:</w:t>
-      </w:r>
-    </w:p>
-    <w:p>
-      <w:r>
-        <w:t xml:space="preserve">Then </w:t>
-      </w:r>
-      <w:r>
-        <w:rPr>
+        <w:t>__________________</w:t>
+      </w:r>
+      <w:r>
+        <w:rPr>
+          <w:b/>
+          <w:bCs/>
+        </w:rPr>
+        <w:t>End Bad:</w:t>
+      </w:r>
+      <w:r>
+        <w:rPr>
+          <w:b/>
+          <w:bCs/>
+        </w:rPr>
+        <w:t>_________________________</w:t>
+      </w:r>
+    </w:p>
+    <w:p>
+      <w:r>
+        <w:t xml:space="preserve">Before falling asleep he looked around once again in all four directions, and he thought that he saw a little spark burning in the distance. The donkey went and had a look inside the house, seeing robbers the donkey did not dare fight them alone. </w:t>
+      </w:r>
+      <w:r>
+        <w:t>Carrying</w:t>
+      </w:r>
+      <w:r>
+        <w:t xml:space="preserve"> on throughout the woods. Tired</w:t>
+      </w:r>
+      <w:r>
+        <w:t>,</w:t>
+      </w:r>
+      <w:r>
+        <w:t xml:space="preserve"> the donkey went to sleep. </w:t>
+      </w:r>
+    </w:p>
+    <w:p>
+      <w:r>
+        <w:t xml:space="preserve">Waking up in the forest with no food and </w:t>
+      </w:r>
+      <w:r>
+        <w:t>feeling lonely, the donkey made their way back to the mill it came from. Treading the day the farmer would not be able to feed them anymore. The donkey dream of being a musician slowly fades away like a distant memory.</w:t>
+      </w:r>
+    </w:p>
+    <w:p>
+      <w:r>
+        <w:br w:type="page"/>
+      </w:r>
+    </w:p>
+    <w:p>
+      <w:r>
+        <w:lastRenderedPageBreak/>
+        <w:t>______________________________________________________________</w:t>
+      </w:r>
+    </w:p>
+    <w:p>
+      <w:pPr>
+        <w:rPr>
+          <w:b/>
+          <w:bCs/>
+        </w:rPr>
+      </w:pPr>
+      <w:r>
+        <w:rPr>
+          <w:b/>
+          <w:bCs/>
+        </w:rPr>
+        <w:t>- o</w:t>
+      </w:r>
+      <w:r>
+        <w:rPr>
+          <w:b/>
+          <w:bCs/>
+        </w:rPr>
+        <w:t xml:space="preserve">ption where </w:t>
+      </w:r>
+      <w:r>
+        <w:rPr>
+          <w:b/>
+          <w:bCs/>
+        </w:rPr>
+        <w:t>all animals joined (total 4)</w:t>
+      </w:r>
+      <w:r>
+        <w:rPr>
+          <w:b/>
+          <w:bCs/>
+        </w:rPr>
+        <w:t xml:space="preserve"> – Mini game – stack the animal tower </w:t>
+      </w:r>
+    </w:p>
+    <w:p>
+      <w:r>
+        <w:t>The donkey and the dog lay down under a big tree, but the cat and the rooster took to the branches. The rooster flew right to the top, where it was safest for him. Before falling asleep he looked around once again in all four directions, and he thought that he saw a little spark burning in the distance. He hollered to his companions, that there must be a house not too far away, for a light was shining.</w:t>
+      </w:r>
+    </w:p>
+    <w:p>
+      <w:r>
+        <w:t>The donkey said, "Then we must get up and go there, because the lodging here is poor." The dog said that he could do well with a few bones with a little meat on them. Thus they set forth toward the place where the light was, and they soon saw it glistening more brightly, and it became larger and larger, until they came to the front of a brightly lit robbers' house.</w:t>
+      </w:r>
+    </w:p>
+    <w:p>
+      <w:r>
+        <w:t>The donkey, the largest of them, approached the window and looked in.</w:t>
+      </w:r>
+    </w:p>
+    <w:p>
+      <w:r>
+        <w:t>"What do you see, Gray-Horse?" asked the rooster.</w:t>
+      </w:r>
+    </w:p>
+    <w:p>
+      <w:r>
+        <w:t>"What do I see?" answered the donkey. "A table set with good things to eat and drink, and robbers sitting there enjoying themselves."</w:t>
+      </w:r>
+    </w:p>
+    <w:p>
+      <w:r>
+        <w:t>"That would be something for us," said the rooster.</w:t>
+      </w:r>
+    </w:p>
+    <w:p>
+      <w:r>
+        <w:t>"Ee-ah, ee-ah, oh, if we were there!" said the donkey.</w:t>
+      </w:r>
+    </w:p>
+    <w:p>
+      <w:pPr>
+        <w:rPr>
+          <w:b/>
+          <w:bCs/>
           <w:highlight w:val="yellow"/>
         </w:rPr>
-        <w:t xml:space="preserve">the </w:t>
-      </w:r>
-      <w:r>
-        <w:rPr>
+      </w:pPr>
+      <w:r>
+        <w:rPr>
+          <w:b/>
+          <w:bCs/>
           <w:highlight w:val="yellow"/>
         </w:rPr>
-        <w:t>donkey</w:t>
-      </w:r>
-      <w:r>
-        <w:rPr>
+        <w:t>The tower game</w:t>
+      </w:r>
+      <w:r>
+        <w:rPr>
+          <w:b/>
+          <w:bCs/>
           <w:highlight w:val="yellow"/>
         </w:rPr>
-        <w:t>/</w:t>
-      </w:r>
-      <w:r>
+        <w:t xml:space="preserve"> – All animals – Good ending</w:t>
+      </w:r>
+    </w:p>
+    <w:p>
+      <w:pPr>
         <w:rPr>
           <w:highlight w:val="yellow"/>
         </w:rPr>
-        <w:t xml:space="preserve"> the two</w:t>
-      </w:r>
+      </w:pPr>
       <w:r>
         <w:rPr>
           <w:highlight w:val="yellow"/>
         </w:rPr>
-        <w:t>/</w:t>
-      </w:r>
+        <w:t xml:space="preserve">Then the animals discussed how they might drive the robbers away, and at last they came upon a plan. The donkey was to stand with his front feet on the window, the dog to jump on the donkey's back, the cat to climb onto the dog, and finally the rooster would fly up and sit on the cat's head. </w:t>
+      </w:r>
+    </w:p>
+    <w:p>
       <w:r>
         <w:rPr>
           <w:highlight w:val="yellow"/>
         </w:rPr>
-        <w:t xml:space="preserve"> the </w:t>
-      </w:r>
-      <w:r>
-        <w:rPr>
-          <w:highlight w:val="yellow"/>
-        </w:rPr>
-        <w:t>three refugees</w:t>
-      </w:r>
-      <w:r>
-        <w:t xml:space="preserve"> came to a farmyard,</w:t>
-      </w:r>
-      <w:r>
-        <w:t xml:space="preserve"> </w:t>
-      </w:r>
-      <w:r>
-        <w:rPr>
-          <w:highlight w:val="yellow"/>
-        </w:rPr>
-        <w:t xml:space="preserve">tired from the </w:t>
-      </w:r>
-      <w:r>
-        <w:rPr>
-          <w:highlight w:val="yellow"/>
-        </w:rPr>
-        <w:t>day’s</w:t>
-      </w:r>
-      <w:r>
-        <w:rPr>
-          <w:highlight w:val="yellow"/>
-        </w:rPr>
-        <w:t xml:space="preserve"> misadventures/ excited but deflated</w:t>
-      </w:r>
-      <w:r>
-        <w:rPr>
-          <w:highlight w:val="yellow"/>
-        </w:rPr>
-        <w:t>/ Elated</w:t>
-      </w:r>
-      <w:r>
-        <w:t xml:space="preserve"> to have found shelter</w:t>
-      </w:r>
-      <w:r>
-        <w:t xml:space="preserve"> and the rooster of the house was sitting on the gate crying with all his might.</w:t>
-      </w:r>
-    </w:p>
-    <w:p>
-      <w:r>
-        <w:t>"Your cries pierce one's marrow and bone," said the donkey. "What are you up to?"</w:t>
-      </w:r>
-    </w:p>
-    <w:p>
-      <w:r>
-        <w:t>"I just prophesied good weather," said the rooster, "because it is Our Dear Lady's Day, when she washes the Christ Child's shirts and wants to dry them; but because Sunday guests are coming tomorrow, the lady of the house has no mercy and told the cook that she wants to eat me tomorrow in the soup, so I am supposed to let them cut off my head this evening. Now I am going to cry at the top of my voice as long as I can."</w:t>
-      </w:r>
-    </w:p>
-    <w:p>
-      <w:pPr>
-        <w:rPr>
-          <w:b/>
-          <w:bCs/>
-        </w:rPr>
-      </w:pPr>
-      <w:r>
-        <w:rPr>
-          <w:b/>
-          <w:bCs/>
-        </w:rPr>
-        <w:t>Option 1.3 (Good):</w:t>
-      </w:r>
-      <w:r>
-        <w:rPr>
-          <w:b/>
-          <w:bCs/>
-        </w:rPr>
-        <w:t xml:space="preserve"> (Companion gained)</w:t>
-      </w:r>
-    </w:p>
-    <w:p>
-      <w:r>
-        <w:t>“</w:t>
-      </w:r>
-      <w:r>
-        <w:t xml:space="preserve"> Hey now my fellow friend! That sounds tragic! My party and me are headed </w:t>
-      </w:r>
-      <w:proofErr w:type="spellStart"/>
-      <w:r>
-        <w:t>of</w:t>
-      </w:r>
-      <w:proofErr w:type="spellEnd"/>
-      <w:r>
-        <w:t xml:space="preserve"> to the city to become musicians! Why not join us and amaze the crowds with your beautiful voice?” Said the donkey excitedly. </w:t>
-      </w:r>
-      <w:r>
-        <w:t>The rooster was happy with the proposal, and all four went off together.</w:t>
-      </w:r>
-    </w:p>
-    <w:p>
-      <w:pPr>
-        <w:rPr>
-          <w:b/>
-          <w:bCs/>
-        </w:rPr>
-      </w:pPr>
-      <w:r>
-        <w:rPr>
-          <w:b/>
-          <w:bCs/>
-        </w:rPr>
-        <w:t xml:space="preserve">Option </w:t>
-      </w:r>
-      <w:r>
-        <w:rPr>
-          <w:b/>
-          <w:bCs/>
-        </w:rPr>
-        <w:t>2</w:t>
-      </w:r>
-      <w:r>
-        <w:rPr>
-          <w:b/>
-          <w:bCs/>
-        </w:rPr>
-        <w:t>.3</w:t>
-      </w:r>
-      <w:r>
-        <w:rPr>
-          <w:b/>
-          <w:bCs/>
-        </w:rPr>
-        <w:t>(</w:t>
-      </w:r>
-      <w:r>
-        <w:rPr>
-          <w:b/>
-          <w:bCs/>
-        </w:rPr>
-        <w:t>Neutral</w:t>
-      </w:r>
-      <w:r>
-        <w:rPr>
-          <w:b/>
-          <w:bCs/>
-        </w:rPr>
-        <w:t>)</w:t>
-      </w:r>
-      <w:r>
-        <w:rPr>
-          <w:b/>
-          <w:bCs/>
-        </w:rPr>
-        <w:t>:</w:t>
-      </w:r>
-      <w:r>
-        <w:rPr>
-          <w:b/>
-          <w:bCs/>
-        </w:rPr>
-        <w:t xml:space="preserve"> </w:t>
-      </w:r>
-      <w:r>
-        <w:rPr>
-          <w:b/>
-          <w:bCs/>
-        </w:rPr>
-        <w:t>(Companion gained)</w:t>
-      </w:r>
-    </w:p>
-    <w:p>
-      <w:r>
-        <w:t>"Hey now, Red-Head," said the donkey, "instead come away with us. We're going to Bremen. You can always find something better than death. You have a good voice, and when we make music together, it will be very pleasing."</w:t>
-      </w:r>
-      <w:r>
-        <w:t xml:space="preserve"> Mentioned the Donkey sheepishly. </w:t>
-      </w:r>
-      <w:r>
-        <w:t xml:space="preserve">The rooster was taken aback by the straight forwardness but agreed nonetheless. </w:t>
-      </w:r>
-    </w:p>
-    <w:p>
-      <w:pPr>
-        <w:rPr>
-          <w:b/>
-          <w:bCs/>
-        </w:rPr>
-      </w:pPr>
-      <w:r>
-        <w:rPr>
-          <w:b/>
-          <w:bCs/>
-        </w:rPr>
-        <w:t xml:space="preserve">Option 3.3(Bad): </w:t>
-      </w:r>
-      <w:r>
-        <w:rPr>
-          <w:b/>
-          <w:bCs/>
-        </w:rPr>
-        <w:t>(</w:t>
-      </w:r>
-      <w:r>
-        <w:rPr>
-          <w:b/>
-          <w:bCs/>
-        </w:rPr>
-        <w:t>No companion gained</w:t>
-      </w:r>
-      <w:r>
-        <w:rPr>
-          <w:b/>
-          <w:bCs/>
-        </w:rPr>
-        <w:t>)</w:t>
-      </w:r>
-    </w:p>
-    <w:p>
-      <w:r>
-        <w:t xml:space="preserve">“ Well that does sound bad but </w:t>
-      </w:r>
-      <w:r>
-        <w:t>with your shrill voice, do you believe you’ll make a difference if you make noises all evening long? Better come with us, might as well put your voice to good use</w:t>
-      </w:r>
-      <w:r>
-        <w:t xml:space="preserve">.” The donkey snorted. </w:t>
-      </w:r>
-      <w:r>
-        <w:t xml:space="preserve">The rooster was appalled and continued with the noise making, </w:t>
-      </w:r>
-      <w:r>
-        <w:t>being louder than before. The donkey lowered their head in shame and walked on</w:t>
-      </w:r>
-      <w:r>
-        <w:t xml:space="preserve"> towards the city</w:t>
-      </w:r>
-      <w:r>
-        <w:t>, regretting their choice of words.</w:t>
-      </w:r>
-    </w:p>
-    <w:p>
-      <w:pPr>
-        <w:rPr>
-          <w:b/>
-          <w:bCs/>
-        </w:rPr>
-      </w:pPr>
-      <w:r>
-        <w:rPr>
-          <w:b/>
-          <w:bCs/>
-        </w:rPr>
-        <w:t xml:space="preserve">Continuation from </w:t>
-      </w:r>
-      <w:r>
-        <w:rPr>
-          <w:b/>
-          <w:bCs/>
-        </w:rPr>
-        <w:t xml:space="preserve">all </w:t>
-      </w:r>
-      <w:r>
-        <w:rPr>
-          <w:b/>
-          <w:bCs/>
-        </w:rPr>
-        <w:t xml:space="preserve">options: </w:t>
-      </w:r>
-    </w:p>
-    <w:p>
-      <w:r>
-        <w:t xml:space="preserve">However, </w:t>
-      </w:r>
-      <w:r>
-        <w:rPr>
-          <w:highlight w:val="yellow"/>
-        </w:rPr>
-        <w:t>the donkey/</w:t>
-      </w:r>
-      <w:r>
-        <w:rPr>
-          <w:highlight w:val="yellow"/>
-        </w:rPr>
-        <w:t>they</w:t>
-      </w:r>
-      <w:r>
-        <w:t xml:space="preserve"> could not reach the city of Bremen in one day, and in the evening </w:t>
-      </w:r>
-      <w:r>
-        <w:rPr>
-          <w:highlight w:val="yellow"/>
-        </w:rPr>
-        <w:t>the donkey/they</w:t>
-      </w:r>
-      <w:r>
-        <w:t xml:space="preserve"> </w:t>
-      </w:r>
-      <w:r>
-        <w:t xml:space="preserve">came into a forest, where </w:t>
-      </w:r>
-      <w:r>
-        <w:rPr>
-          <w:highlight w:val="yellow"/>
-        </w:rPr>
-        <w:t>the donkey/they</w:t>
-      </w:r>
-      <w:r>
-        <w:t xml:space="preserve"> </w:t>
-      </w:r>
-      <w:r>
-        <w:t xml:space="preserve">would spend the night. </w:t>
-      </w:r>
-    </w:p>
-    <w:p>
-      <w:pPr>
-        <w:rPr>
-          <w:b/>
-          <w:bCs/>
-        </w:rPr>
-      </w:pPr>
-      <w:r>
-        <w:rPr>
-          <w:b/>
-          <w:bCs/>
-        </w:rPr>
-        <w:t>__________________</w:t>
-      </w:r>
-      <w:r>
-        <w:rPr>
-          <w:b/>
-          <w:bCs/>
-        </w:rPr>
-        <w:t>End Bad:</w:t>
-      </w:r>
-      <w:r>
-        <w:rPr>
-          <w:b/>
-          <w:bCs/>
-        </w:rPr>
-        <w:t>_________________________</w:t>
-      </w:r>
-    </w:p>
-    <w:p>
-      <w:r>
-        <w:t xml:space="preserve">Before falling asleep he looked around once again in all four directions, and he thought that he saw a little spark burning in the distance. The donkey went and had a look inside </w:t>
+        <w:t>When they had done that, at a signal they began to make their music all together. The donkey brayed, the dog barked, the cat meowed and the rooster crowed. Then they crashed through the window into the room, shattering the panes.</w:t>
+      </w:r>
+    </w:p>
+    <w:p/>
+    <w:p>
+      <w:r>
+        <w:t xml:space="preserve">The robbers jumped up at the terrible bellowing, thinking that a ghost was coming in, and fled in great fear out into the woods. Then the </w:t>
+      </w:r>
+      <w:r>
+        <w:t>four</w:t>
+      </w:r>
+      <w:r>
+        <w:t xml:space="preserve"> companions seated themselves at the table and freely partook of the leftovers, eating as if they would get nothing more for four weeks.</w:t>
+      </w:r>
+    </w:p>
+    <w:p>
+      <w:r>
+        <w:t xml:space="preserve">When the four minstrels were finished, they put out the light and looked for a place to sleep, each according to </w:t>
+      </w:r>
+      <w:r>
+        <w:t>their</w:t>
+      </w:r>
+      <w:r>
+        <w:t xml:space="preserve"> nature and </w:t>
+      </w:r>
+      <w:r>
+        <w:t>their</w:t>
+      </w:r>
+      <w:r>
+        <w:t xml:space="preserve"> desire. The donkey lay down on the </w:t>
+      </w:r>
+      <w:r>
+        <w:t>hay</w:t>
+      </w:r>
+      <w:r>
+        <w:t xml:space="preserve"> pile, the dog behind the door, the cat on the hearth next to the warm ashes, and the </w:t>
       </w:r>
       <w:r>
         <w:lastRenderedPageBreak/>
-        <w:t xml:space="preserve">the house, seeing robbers the donkey did not dare fight them alone. </w:t>
-      </w:r>
-      <w:r>
-        <w:t>Carrying</w:t>
-      </w:r>
-      <w:r>
-        <w:t xml:space="preserve"> on throughout the woods. Tired</w:t>
-      </w:r>
-      <w:r>
-        <w:t>,</w:t>
-      </w:r>
-      <w:r>
-        <w:t xml:space="preserve"> the donkey went to sleep. </w:t>
-      </w:r>
-    </w:p>
-    <w:p>
-      <w:r>
-        <w:t xml:space="preserve">Waking up in the forest with no food and </w:t>
-      </w:r>
-      <w:r>
-        <w:t>feeling lonely, the donkey made their way back to the mill it came from. Treading the day the farmer would not be able to feed them anymore. The donkey dream of being a musician slowly fades away like a distant memory.</w:t>
-      </w:r>
-    </w:p>
-    <w:p>
-      <w:r>
-        <w:t>______________________________________________________________</w:t>
-      </w:r>
-    </w:p>
-    <w:p>
-      <w:pPr>
-        <w:rPr>
-          <w:b/>
-          <w:bCs/>
-        </w:rPr>
-      </w:pPr>
-      <w:r>
-        <w:rPr>
-          <w:b/>
-          <w:bCs/>
-        </w:rPr>
-        <w:t>- o</w:t>
-      </w:r>
-      <w:r>
-        <w:rPr>
-          <w:b/>
-          <w:bCs/>
-        </w:rPr>
-        <w:t xml:space="preserve">ption where </w:t>
-      </w:r>
-      <w:r>
-        <w:rPr>
-          <w:b/>
-          <w:bCs/>
-        </w:rPr>
-        <w:t>all animals joined (total 4)</w:t>
-      </w:r>
-      <w:r>
-        <w:rPr>
-          <w:b/>
-          <w:bCs/>
-        </w:rPr>
-        <w:t xml:space="preserve"> – Mini game – stack the animal tower </w:t>
-      </w:r>
-    </w:p>
-    <w:p>
-      <w:r>
-        <w:t>The donkey and the dog lay down under a big tree, but the cat and the rooster took to the branches. The rooster flew right to the top, where it was safest for him. Before falling asleep he looked around once again in all four directions, and he thought that he saw a little spark burning in the distance. He hollered to his companions, that there must be a house not too far away, for a light was shining.</w:t>
-      </w:r>
-    </w:p>
-    <w:p>
-      <w:r>
-        <w:t>The donkey said, "Then we must get up and go there, because the lodging here is poor." The dog said that he could do well with a few bones with a little meat on them. Thus they set forth toward the place where the light was, and they soon saw it glistening more brightly, and it became larger and larger, until they came to the front of a brightly lit robbers' house.</w:t>
-      </w:r>
-    </w:p>
-    <w:p>
-      <w:r>
-        <w:t>The donkey, the largest of them, approached the window and looked in.</w:t>
-      </w:r>
-    </w:p>
-    <w:p>
-      <w:r>
-        <w:t>"What do you see, Gray-Horse?" asked the rooster.</w:t>
-      </w:r>
-    </w:p>
-    <w:p>
-      <w:r>
-        <w:t>"What do I see?" answered the donkey. "A table set with good things to eat and drink, and robbers sitting there enjoying themselves."</w:t>
-      </w:r>
-    </w:p>
-    <w:p>
-      <w:r>
-        <w:t>"That would be something for us," said the rooster.</w:t>
-      </w:r>
-    </w:p>
-    <w:p>
-      <w:r>
-        <w:t>"Ee-ah, ee-ah, oh, if we were there!" said the donkey.</w:t>
-      </w:r>
-    </w:p>
-    <w:p>
-      <w:pPr>
-        <w:rPr>
-          <w:b/>
-          <w:bCs/>
-          <w:highlight w:val="yellow"/>
-        </w:rPr>
-      </w:pPr>
-      <w:r>
-        <w:rPr>
-          <w:b/>
-          <w:bCs/>
-          <w:highlight w:val="yellow"/>
-        </w:rPr>
-        <w:t>The tower game</w:t>
-      </w:r>
-      <w:r>
-        <w:rPr>
-          <w:b/>
-          <w:bCs/>
-          <w:highlight w:val="yellow"/>
-        </w:rPr>
-        <w:t xml:space="preserve"> – All animals – Good ending</w:t>
-      </w:r>
-    </w:p>
-    <w:p>
-      <w:pPr>
-        <w:rPr>
-          <w:highlight w:val="yellow"/>
-        </w:rPr>
-      </w:pPr>
-      <w:r>
-        <w:rPr>
-          <w:highlight w:val="yellow"/>
-        </w:rPr>
-        <w:t xml:space="preserve">Then the animals discussed how they might drive the robbers away, and at last they came upon a plan. The donkey was to stand with his front feet on the window, the dog to jump on the donkey's back, the cat to climb onto the dog, and finally the rooster would fly up and sit on the cat's head. </w:t>
-      </w:r>
-    </w:p>
-    <w:p>
-      <w:r>
-        <w:rPr>
-          <w:highlight w:val="yellow"/>
-        </w:rPr>
-        <w:t>When they had done that, at a signal they began to make their music all together. The donkey brayed, the dog barked, the cat meowed and the rooster crowed. Then they crashed through the window into the room, shattering the panes.</w:t>
-      </w:r>
-    </w:p>
-    <w:p>
-      <w:pPr>
-        <w:rPr>
-          <w:b/>
-          <w:bCs/>
-          <w:highlight w:val="yellow"/>
-        </w:rPr>
-      </w:pPr>
-    </w:p>
-    <w:p/>
-    <w:p>
-      <w:r>
-        <w:lastRenderedPageBreak/>
-        <w:t xml:space="preserve">The robbers jumped up at the terrible bellowing, thinking that a ghost was coming in, and fled in great fear out into the woods. Then the </w:t>
-      </w:r>
-      <w:r>
-        <w:t>four</w:t>
-      </w:r>
-      <w:r>
-        <w:t xml:space="preserve"> companions seated themselves at the table and freely partook of the leftovers, eating as if they would get nothing more for four weeks.</w:t>
-      </w:r>
-    </w:p>
-    <w:p>
-      <w:r>
-        <w:t xml:space="preserve">When the four minstrels were finished, they put out the light and looked for a place to sleep, each according to </w:t>
-      </w:r>
-      <w:r>
-        <w:t>their</w:t>
-      </w:r>
-      <w:r>
-        <w:t xml:space="preserve"> nature and </w:t>
-      </w:r>
-      <w:r>
-        <w:t>their</w:t>
-      </w:r>
-      <w:r>
-        <w:t xml:space="preserve"> desire. The donkey lay down on the </w:t>
-      </w:r>
-      <w:r>
-        <w:t>hay</w:t>
-      </w:r>
-      <w:r>
-        <w:t xml:space="preserve"> pile, the dog behind the door, the cat on the hearth next to the warm ashes, and the rooster sat on the beam of the roof. Because they were tired from their long journey, they soon fell asleep.</w:t>
+        <w:t>rooster sat on the beam of the roof. Because they were tired from their long journey, they soon fell asleep.</w:t>
       </w:r>
     </w:p>
     <w:p>
@@ -1353,7 +1226,14 @@
           <w:b/>
           <w:bCs/>
         </w:rPr>
-        <w:t xml:space="preserve"> (only if cat joined</w:t>
+        <w:t xml:space="preserve"> (</w:t>
+      </w:r>
+      <w:r>
+        <w:rPr>
+          <w:b/>
+          <w:bCs/>
+        </w:rPr>
+        <w:t>if dog, cat and rooster joined</w:t>
       </w:r>
       <w:r>
         <w:rPr>
@@ -1496,37 +1376,56 @@
     </w:p>
     <w:p>
       <w:r>
-        <w:t>The donkey and the dog lay down under a big tree, but the cat and the rooster took to the branches. The rooster flew right to the top, where it was safest for him. Before falling asleep he looked around once again in all four directions, and he thought that he saw a little spark burning in the distance. He hollered to his companions, that there must be a house not too far away, for a light was shining.</w:t>
-      </w:r>
-    </w:p>
-    <w:p>
-      <w:r>
-        <w:t>The donkey said, "Then we must get up and go there, because the lodging here is poor." The dog said that he could do well with a few bones with a little meat on them. Thus they set forth toward the place where the light was, and they soon saw it glistening more brightly, and it became larger and larger, until they came to the front of a brightly lit robbers' house.</w:t>
-      </w:r>
-    </w:p>
-    <w:p>
-      <w:r>
-        <w:t>The donkey, the largest of them, approached the window and looked in.</w:t>
-      </w:r>
-    </w:p>
-    <w:p>
-      <w:r>
-        <w:t>"What do you see, Gray-Horse?" asked the rooster.</w:t>
-      </w:r>
-    </w:p>
-    <w:p>
-      <w:r>
-        <w:t>"What do I see?" answered the donkey. "A table set with good things to eat and drink, and robbers sitting there enjoying themselves."</w:t>
-      </w:r>
-    </w:p>
-    <w:p>
-      <w:r>
-        <w:t>"That would be something for us," said the rooster.</w:t>
-      </w:r>
-    </w:p>
-    <w:p>
-      <w:r>
-        <w:t>"Ee-ah, ee-ah, oh, if we were there!" said the donkey.</w:t>
+        <w:t>The donkey and his companion or companions settled down beneath a large tree in the forest. They had not gathered a complete band, but the donkey was no longer making the journey alone.</w:t>
+      </w:r>
+    </w:p>
+    <w:p>
+      <w:r>
+        <w:t>Before they could fall asleep, one of the animals noticed a little spark burning in the distance. It seemed that there must be a house nearby, for a light was shining through the darkness.</w:t>
+      </w:r>
+    </w:p>
+    <w:p>
+      <w:r>
+        <w:t>“Then we should go there,” said the donkey. “The lodging here is poor, and perhaps we may find something to eat.”</w:t>
+      </w:r>
+    </w:p>
+    <w:p>
+      <w:r>
+        <w:t>Tired and hungry, the small group set forth toward the light. It grew brighter and larger until they came to the front of a brightly lit robbers’ house.</w:t>
+      </w:r>
+    </w:p>
+    <w:p>
+      <w:r>
+        <w:t>The donkey, being the largest of them, approached the window and looked in.</w:t>
+      </w:r>
+    </w:p>
+    <w:p>
+      <w:r>
+        <w:t xml:space="preserve">“What do you </w:t>
+      </w:r>
+      <w:r>
+        <w:t>s</w:t>
+      </w:r>
+      <w:r>
+        <w:t>ee?” asked one of his companions.</w:t>
+      </w:r>
+    </w:p>
+    <w:p>
+      <w:r>
+        <w:t>“What do I see?” answered the donkey. “A table set with good things to eat and drink, and robbers sitting there enjoying themselves.”</w:t>
+      </w:r>
+    </w:p>
+    <w:p>
+      <w:r>
+        <w:t>“That would be something for us,” said his companion.</w:t>
+      </w:r>
+    </w:p>
+    <w:p>
+      <w:r>
+        <w:t>“Ee-ah, ee-ah, oh, if we were there!” said the donkey</w:t>
+      </w:r>
+      <w:r>
+        <w:t>.</w:t>
       </w:r>
     </w:p>
     <w:p>
@@ -1551,7 +1450,39 @@
           <w:bCs/>
           <w:highlight w:val="yellow"/>
         </w:rPr>
-        <w:t xml:space="preserve"> – All animals – neutral ending (no cat / rooster/ or dog) </w:t>
+        <w:t xml:space="preserve"> – </w:t>
+      </w:r>
+      <w:r>
+        <w:rPr>
+          <w:b/>
+          <w:bCs/>
+          <w:highlight w:val="yellow"/>
+        </w:rPr>
+        <w:t>at least one more</w:t>
+      </w:r>
+      <w:r>
+        <w:rPr>
+          <w:b/>
+          <w:bCs/>
+          <w:highlight w:val="yellow"/>
+        </w:rPr>
+        <w:t xml:space="preserve"> animal</w:t>
+      </w:r>
+      <w:r>
+        <w:rPr>
+          <w:b/>
+          <w:bCs/>
+          <w:highlight w:val="yellow"/>
+        </w:rPr>
+        <w:t xml:space="preserve"> joins the donkey</w:t>
+      </w:r>
+      <w:r>
+        <w:rPr>
+          <w:b/>
+          <w:bCs/>
+          <w:highlight w:val="yellow"/>
+        </w:rPr>
+        <w:t xml:space="preserve"> – neutral ending </w:t>
       </w:r>
     </w:p>
     <w:p>
@@ -1609,299 +1540,269 @@
       </w:r>
     </w:p>
     <w:p>
-      <w:pPr>
-        <w:rPr>
-          <w:highlight w:val="yellow"/>
-        </w:rPr>
-      </w:pPr>
-      <w:r>
-        <w:rPr>
-          <w:highlight w:val="yellow"/>
-        </w:rPr>
-        <w:t xml:space="preserve">Then the animals discussed how they might drive the robbers away, and at last they came upon a plan. The donkey was to stand with his front feet on the window, the </w:t>
-      </w:r>
-      <w:r>
-        <w:rPr>
-          <w:highlight w:val="yellow"/>
-        </w:rPr>
-        <w:t>second animal</w:t>
-      </w:r>
-      <w:r>
-        <w:rPr>
-          <w:highlight w:val="yellow"/>
-        </w:rPr>
-        <w:t xml:space="preserve"> to jump on the donkey's back, </w:t>
-      </w:r>
-      <w:r>
-        <w:rPr>
-          <w:highlight w:val="yellow"/>
+      <w:r>
+        <w:t>Although there were fewer of them than there might have been, the animals discussed how they could drive the robbers away. At last, they came upon a desperate plan: they would climb onto one another as well as they could, crash against the window, and make the most terrible music the robbers had ever heard.</w:t>
+      </w:r>
+    </w:p>
+    <w:p>
+      <w:r>
+        <w:t>The donkey stood at the bottom of their small tower. Any companions who had joined him climbed above him, each trying to appear louder and more frightening than they truly felt.</w:t>
+      </w:r>
+    </w:p>
+    <w:p>
+      <w:r>
+        <w:t>At the donkey’s signal, they began their music together. The donkey brayed at the top of his lungs, while his companion or companions added their own cries to the dreadful concert. Then they crashed through the window into the room, shattering the panes.</w:t>
+      </w:r>
+    </w:p>
+    <w:p/>
+    <w:p>
+      <w:r>
+        <w:lastRenderedPageBreak/>
+        <w:t>The robbers jumped up at the terrible noise. In the confusion and darkness, they believed that some horrible creature had broken into their house, and they fled in great fear into the woods.</w:t>
+      </w:r>
+    </w:p>
+    <w:p>
+      <w:r>
+        <w:t>When the minstrels were finished, they put out the light and looked for places to sleep, each according to their nature and desire. The donkey lay down on the hay pile.</w:t>
+      </w:r>
+    </w:p>
+    <w:p>
+      <w:pPr>
+        <w:rPr>
+          <w:b/>
+          <w:bCs/>
+        </w:rPr>
+      </w:pPr>
+      <w:r>
+        <w:rPr>
+          <w:b/>
+          <w:bCs/>
+        </w:rPr>
+        <w:t>Insert only the lines for the animals who joined:</w:t>
+      </w:r>
+    </w:p>
+    <w:p>
+      <w:pPr>
+        <w:pStyle w:val="ListParagraph"/>
+        <w:numPr>
+          <w:ilvl w:val="0"/>
+          <w:numId w:val="2"/>
+        </w:numPr>
+        <w:rPr>
           <w:u w:val="single"/>
         </w:rPr>
-        <w:t>(depending how many joined the donkey</w:t>
-      </w:r>
-      <w:r>
-        <w:rPr>
-          <w:highlight w:val="yellow"/>
-        </w:rPr>
-        <w:t xml:space="preserve">) </w:t>
-      </w:r>
-      <w:r>
-        <w:rPr>
-          <w:highlight w:val="yellow"/>
-        </w:rPr>
-        <w:t xml:space="preserve">and finally the rooster would fly up and sit on the cat's head. </w:t>
-      </w:r>
-    </w:p>
-    <w:p>
-      <w:r>
-        <w:rPr>
-          <w:highlight w:val="yellow"/>
-        </w:rPr>
-        <w:t xml:space="preserve">When they had done that, at a signal they began to make their music all together. </w:t>
-      </w:r>
-      <w:r>
-        <w:rPr>
-          <w:i/>
-          <w:iCs/>
-          <w:highlight w:val="yellow"/>
+      </w:pPr>
+      <w:r>
+        <w:rPr>
           <w:u w:val="single"/>
         </w:rPr>
-        <w:t xml:space="preserve">The donkey brayed, the dog barked, and the rooster crowed. </w:t>
-      </w:r>
-      <w:r>
-        <w:rPr>
-          <w:highlight w:val="yellow"/>
-        </w:rPr>
-        <w:t>Then they crashed through the window into the room, shattering the panes.</w:t>
-      </w:r>
-    </w:p>
-    <w:p>
-      <w:r>
-        <w:t>The robbers jumped up at the terrible bellowing, thinking that a ghost was coming in, and fled in great fear out into the woods. Then the companions seated themselves at the table and freely partook of the leftovers, eating as if they would get nothing more for four weeks.</w:t>
-      </w:r>
-    </w:p>
-    <w:p>
-      <w:r>
-        <w:t xml:space="preserve">When the minstrels were finished, they put out the light and looked for a place to sleep, each according to </w:t>
-      </w:r>
-      <w:r>
-        <w:t>their</w:t>
-      </w:r>
-      <w:r>
-        <w:t xml:space="preserve"> nature and </w:t>
-      </w:r>
-      <w:r>
-        <w:t>their</w:t>
-      </w:r>
-      <w:r>
-        <w:t xml:space="preserve"> desire. </w:t>
-      </w:r>
-      <w:r>
-        <w:t xml:space="preserve">The donkey lay down on the </w:t>
-      </w:r>
-      <w:r>
-        <w:t>hay</w:t>
-      </w:r>
-      <w:r>
-        <w:t xml:space="preserve"> pile, </w:t>
-      </w:r>
-      <w:r>
-        <w:rPr>
-          <w:highlight w:val="yellow"/>
-        </w:rPr>
-        <w:t>the dog behind the door</w:t>
-      </w:r>
-      <w:r>
-        <w:t xml:space="preserve"> and </w:t>
-      </w:r>
-      <w:r>
-        <w:rPr>
-          <w:highlight w:val="yellow"/>
-        </w:rPr>
-        <w:t>the rooster sat on the beam of the roof.</w:t>
-      </w:r>
-      <w:r>
-        <w:t xml:space="preserve"> Because they were tired from their long journey, they soon fell asleep.</w:t>
+        <w:t>If the dog joined:</w:t>
+      </w:r>
+    </w:p>
+    <w:p>
+      <w:pPr>
+        <w:pStyle w:val="ListParagraph"/>
+      </w:pPr>
+      <w:r>
+        <w:t>The dog curled up behind the door, ready to wake at the slightest sound.</w:t>
+      </w:r>
+    </w:p>
+    <w:p>
+      <w:pPr>
+        <w:pStyle w:val="ListParagraph"/>
+        <w:numPr>
+          <w:ilvl w:val="0"/>
+          <w:numId w:val="2"/>
+        </w:numPr>
+        <w:rPr>
+          <w:u w:val="single"/>
+        </w:rPr>
+      </w:pPr>
+      <w:r>
+        <w:rPr>
+          <w:u w:val="single"/>
+        </w:rPr>
+        <w:t>If the cat joined:</w:t>
+      </w:r>
+    </w:p>
+    <w:p>
+      <w:pPr>
+        <w:pStyle w:val="ListParagraph"/>
+      </w:pPr>
+      <w:r>
+        <w:t>The cat settled on the hearth beside the warm ashes, finally finding a place where no one would chase her away.</w:t>
+      </w:r>
+    </w:p>
+    <w:p>
+      <w:pPr>
+        <w:pStyle w:val="ListParagraph"/>
+        <w:numPr>
+          <w:ilvl w:val="0"/>
+          <w:numId w:val="2"/>
+        </w:numPr>
+        <w:rPr>
+          <w:u w:val="single"/>
+        </w:rPr>
+      </w:pPr>
+      <w:r>
+        <w:rPr>
+          <w:u w:val="single"/>
+        </w:rPr>
+        <w:t>If the rooster joined:</w:t>
+      </w:r>
+    </w:p>
+    <w:p>
+      <w:pPr>
+        <w:pStyle w:val="ListParagraph"/>
+      </w:pPr>
+      <w:r>
+        <w:t>The rooster flew up onto a beam of the roof, where he could watch safely from above.</w:t>
+      </w:r>
+    </w:p>
+    <w:p>
+      <w:pPr>
+        <w:rPr>
+          <w:b/>
+          <w:bCs/>
+        </w:rPr>
+      </w:pPr>
+      <w:r>
+        <w:rPr>
+          <w:b/>
+          <w:bCs/>
+        </w:rPr>
+        <w:t>Continue after the inserted lines:</w:t>
+      </w:r>
+    </w:p>
+    <w:p>
+      <w:r>
+        <w:t>Because they were tired from their long journey and the excitement of the night, they soon fell asleep.</w:t>
+      </w:r>
+    </w:p>
+    <w:p>
+      <w:r>
+        <w:t>When midnight had passed, the robbers saw from a distance that the light was no longer burning in the house and that everything appeared quiet. Their captain said, “We should not have let ourselves be chased away,” and he sent one of them back to investigate the house.</w:t>
+      </w:r>
+    </w:p>
+    <w:p>
+      <w:r>
+        <w:t>The robber carefully entered the dark house, believing that the frightening creatures from earlier had disappeared.</w:t>
+      </w:r>
+    </w:p>
+    <w:p>
+      <w:pPr>
+        <w:rPr>
+          <w:b/>
+          <w:bCs/>
+        </w:rPr>
+      </w:pPr>
+      <w:r>
+        <w:rPr>
+          <w:b/>
+          <w:bCs/>
+        </w:rPr>
+        <w:t>Insert only the reaction lines for the animals who joined:</w:t>
+      </w:r>
+    </w:p>
+    <w:p>
+      <w:pPr>
+        <w:rPr>
+          <w:u w:val="single"/>
+        </w:rPr>
+      </w:pPr>
+      <w:r>
+        <w:rPr>
+          <w:u w:val="single"/>
+        </w:rPr>
+        <w:t>If the cat joined:</w:t>
+      </w:r>
+    </w:p>
+    <w:p>
+      <w:r>
+        <w:t>In the kitchen, the robber mistook the cat’s glowing eyes for live coals and stepped closer to light his match. The cat sprang at his face, hissing and scratching until he stumbled backward in terror.</w:t>
+      </w:r>
+    </w:p>
+    <w:p>
+      <w:pPr>
+        <w:rPr>
+          <w:u w:val="single"/>
+        </w:rPr>
+      </w:pPr>
+      <w:r>
+        <w:rPr>
+          <w:u w:val="single"/>
+        </w:rPr>
+        <w:t>If the dog joined:</w:t>
+      </w:r>
+    </w:p>
+    <w:p>
+      <w:r>
+        <w:t>As the robber turned toward the door, the dog jumped up from the shadows and bit him sharply in the leg.</w:t>
+      </w:r>
+    </w:p>
+    <w:p>
+      <w:pPr>
+        <w:rPr>
+          <w:u w:val="single"/>
+        </w:rPr>
+      </w:pPr>
+      <w:r>
+        <w:rPr>
+          <w:u w:val="single"/>
+        </w:rPr>
+        <w:t>If the rooster joined:</w:t>
+      </w:r>
+    </w:p>
+    <w:p>
+      <w:r>
+        <w:t>Awakened by the noise below, the rooster cried down from the beam with a shriek so sudden and loud that the robber believed he was being judged by a monster above him</w:t>
       </w:r>
     </w:p>
     <w:p>
       <w:r>
         <w:lastRenderedPageBreak/>
-        <w:t>When midnight had passed and the robbers saw from the distance that the light was no longer burning in the house, and everything appeared to be quiet, the captain said, "We shouldn't have let ourselves be chased off," and he told one of them to go back and investigate the house. The one they sent found everything still and went into the kitchen to strike a light.</w:t>
-      </w:r>
-    </w:p>
-    <w:p>
-      <w:pPr>
-        <w:rPr>
-          <w:b/>
-          <w:bCs/>
-        </w:rPr>
-      </w:pPr>
-      <w:r>
-        <w:rPr>
-          <w:b/>
-          <w:bCs/>
-        </w:rPr>
-        <w:t>_______________________</w:t>
-      </w:r>
-      <w:r>
-        <w:rPr>
-          <w:b/>
-          <w:bCs/>
-        </w:rPr>
-        <w:t>If dog and rooster joined:</w:t>
-      </w:r>
-      <w:r>
-        <w:rPr>
-          <w:b/>
-          <w:bCs/>
-        </w:rPr>
-        <w:t>______________________________</w:t>
-      </w:r>
-    </w:p>
-    <w:p>
-      <w:r>
-        <w:t>Walking inside the hous</w:t>
-      </w:r>
-      <w:r>
-        <w:t>e,</w:t>
-      </w:r>
-      <w:r>
-        <w:t xml:space="preserve"> </w:t>
-      </w:r>
-      <w:r>
-        <w:t>the dog, who was lying there, jumped up and bit him in the leg before they could strike a light. When he ran across the yard</w:t>
-      </w:r>
-      <w:r>
-        <w:t>,</w:t>
-      </w:r>
-      <w:r>
-        <w:t xml:space="preserve"> past the </w:t>
-      </w:r>
-      <w:r>
-        <w:t>hay</w:t>
-      </w:r>
-      <w:r>
-        <w:t xml:space="preserve"> pile, the donkey gave him a healthy blow with his hind foot, and the rooster, who had been awakened from his sleep by the noise and was now alert, cried down from the beam, "Cock-a-doodle-doo!"</w:t>
-      </w:r>
-    </w:p>
-    <w:p>
-      <w:r>
-        <w:t>Then the robber ran as fast as he could back to his captain and said, "Oh, there is a man with a knife standing in front of the door, and he stabbed me in the leg. And a black monster is lying in the yard, and it struck at me with a wooden club. And the judge is sitting up there on the roof, and he was calling out, 'Bring the rascal here.' Then I did what I could to get away."</w:t>
-      </w:r>
-    </w:p>
-    <w:p>
-      <w:r>
-        <w:t>From that time forth, the robbers did not dare go back into the house. However, the four Bremen Musicians liked it so well there, that they never left it again</w:t>
+        <w:t>When the robber ran across the yard past the hay pile, the donkey gave him a powerful blow with his hind foot. Terrified and bruised, the robber fled as fast as he could back to his captain</w:t>
       </w:r>
       <w:r>
         <w:t>.</w:t>
       </w:r>
-      <w:r>
-        <w:t>___________________</w:t>
-      </w:r>
-    </w:p>
-    <w:p>
-      <w:pPr>
-        <w:rPr>
-          <w:b/>
-          <w:bCs/>
-        </w:rPr>
-      </w:pPr>
-    </w:p>
-    <w:p>
-      <w:pPr>
-        <w:rPr>
-          <w:b/>
-          <w:bCs/>
-        </w:rPr>
-      </w:pPr>
-      <w:r>
-        <w:rPr>
-          <w:b/>
-          <w:bCs/>
-        </w:rPr>
-        <w:t>_________________</w:t>
-      </w:r>
-      <w:r>
-        <w:rPr>
-          <w:b/>
-          <w:bCs/>
-        </w:rPr>
-        <w:t>If only one animal joined the donkey;</w:t>
-      </w:r>
-      <w:r>
-        <w:rPr>
-          <w:b/>
-          <w:bCs/>
-        </w:rPr>
-        <w:t>_____________________</w:t>
-      </w:r>
-    </w:p>
-    <w:p>
-      <w:r>
-        <w:t xml:space="preserve">The robbers thought they did it until they spotted the second animal growling / </w:t>
-      </w:r>
-      <w:r>
-        <w:t>making noises to alert the donkey</w:t>
-      </w:r>
-      <w:r>
-        <w:t>,</w:t>
-      </w:r>
-      <w:r>
-        <w:t xml:space="preserve"> scar</w:t>
-      </w:r>
-      <w:r>
-        <w:t>ing</w:t>
-      </w:r>
-      <w:r>
-        <w:t xml:space="preserve"> the robbers</w:t>
-      </w:r>
-      <w:r>
-        <w:t xml:space="preserve"> and</w:t>
-      </w:r>
-      <w:r>
-        <w:t xml:space="preserve"> making a run for it. When he ran across the yard, past the </w:t>
-      </w:r>
-      <w:r>
-        <w:t>hay</w:t>
-      </w:r>
-      <w:r>
-        <w:t xml:space="preserve"> pile, the donkey gave him a healthy blow with his hind foot.</w:t>
-      </w:r>
-    </w:p>
-    <w:p>
-      <w:r>
-        <w:t>Then the robber ran as fast as he could back to his captain and said, "Oh,</w:t>
-      </w:r>
-      <w:r>
-        <w:t xml:space="preserve"> there is a </w:t>
-      </w:r>
-      <w:r>
-        <w:t>black monster is lying in the yard, and it struck at me with a wooden club.</w:t>
-      </w:r>
-      <w:r>
-        <w:t xml:space="preserve"> We must be careful</w:t>
-      </w:r>
-      <w:r>
-        <w:t>, it’s best to avoid that house!</w:t>
-      </w:r>
-      <w:r>
-        <w:t>”</w:t>
-      </w:r>
-    </w:p>
-    <w:p>
-      <w:r>
-        <w:t xml:space="preserve"> </w:t>
-      </w:r>
-      <w:r>
-        <w:t>From that time forth, the robbers did not dare go back into the house. However, the four Bremen Musicians liked it so well there, that they never left it again</w:t>
-      </w:r>
-      <w:r>
-        <w:t>._______________</w:t>
-      </w:r>
     </w:p>
     <w:p/>
+    <w:p>
+      <w:r>
+        <w:t>When the robber returned to his captain, he could barely speak from fear.</w:t>
+      </w:r>
+    </w:p>
+    <w:p>
+      <w:r>
+        <w:t>“There is a black monster lying in the yard,” he cried, “and it struck me with a wooden club! There are other terrible creatures hiding inside as well. We must stay far away from that house!”</w:t>
+      </w:r>
+    </w:p>
+    <w:p>
+      <w:r>
+        <w:t>From that time forth, the robbers did not dare go back into the house.</w:t>
+      </w:r>
+      <w:r>
+        <w:t xml:space="preserve"> The animals decided to make this their home and keep living there.</w:t>
+      </w:r>
+    </w:p>
+    <w:p>
+      <w:r>
+        <w:t xml:space="preserve">The donkey and his </w:t>
+      </w:r>
+      <w:r>
+        <w:t xml:space="preserve">band </w:t>
+      </w:r>
+      <w:r>
+        <w:t xml:space="preserve">were relieved to have found safety and shelter. </w:t>
+      </w:r>
+      <w:r>
+        <w:t>As</w:t>
+      </w:r>
+      <w:r>
+        <w:t xml:space="preserve"> the donkey looked at their small group, he could not help but think of the voices that were missing from their music. They had succeeded, but they were not yet the grand band he had dreamed of becoming.</w:t>
+      </w:r>
+    </w:p>
     <w:p>
       <w:r>
         <w:t>_______________________________________________________________________</w:t>
@@ -2032,8 +1933,124 @@
       </w:rPr>
     </w:lvl>
   </w:abstractNum>
+  <w:abstractNum w:abstractNumId="1" w15:restartNumberingAfterBreak="0">
+    <w:nsid w:val="65B3461E"/>
+    <w:multiLevelType w:val="hybridMultilevel"/>
+    <w:tmpl w:val="54D4D2BC"/>
+    <w:lvl w:ilvl="0" w:tplc="04090001">
+      <w:start w:val="1"/>
+      <w:numFmt w:val="bullet"/>
+      <w:lvlText w:val=""/>
+      <w:lvlJc w:val="left"/>
+      <w:pPr>
+        <w:ind w:left="720" w:hanging="360"/>
+      </w:pPr>
+      <w:rPr>
+        <w:rFonts w:ascii="Symbol" w:hAnsi="Symbol" w:hint="default"/>
+      </w:rPr>
+    </w:lvl>
+    <w:lvl w:ilvl="1" w:tplc="04090003" w:tentative="1">
+      <w:start w:val="1"/>
+      <w:numFmt w:val="bullet"/>
+      <w:lvlText w:val="o"/>
+      <w:lvlJc w:val="left"/>
+      <w:pPr>
+        <w:ind w:left="1440" w:hanging="360"/>
+      </w:pPr>
+      <w:rPr>
+        <w:rFonts w:ascii="Courier New" w:hAnsi="Courier New" w:cs="Courier New" w:hint="default"/>
+      </w:rPr>
+    </w:lvl>
+    <w:lvl w:ilvl="2" w:tplc="04090005" w:tentative="1">
+      <w:start w:val="1"/>
+      <w:numFmt w:val="bullet"/>
+      <w:lvlText w:val=""/>
+      <w:lvlJc w:val="left"/>
+      <w:pPr>
+        <w:ind w:left="2160" w:hanging="360"/>
+      </w:pPr>
+      <w:rPr>
+        <w:rFonts w:ascii="Wingdings" w:hAnsi="Wingdings" w:hint="default"/>
+      </w:rPr>
+    </w:lvl>
+    <w:lvl w:ilvl="3" w:tplc="04090001" w:tentative="1">
+      <w:start w:val="1"/>
+      <w:numFmt w:val="bullet"/>
+      <w:lvlText w:val=""/>
+      <w:lvlJc w:val="left"/>
+      <w:pPr>
+        <w:ind w:left="2880" w:hanging="360"/>
+      </w:pPr>
+      <w:rPr>
+        <w:rFonts w:ascii="Symbol" w:hAnsi="Symbol" w:hint="default"/>
+      </w:rPr>
+    </w:lvl>
+    <w:lvl w:ilvl="4" w:tplc="04090003" w:tentative="1">
+      <w:start w:val="1"/>
+      <w:numFmt w:val="bullet"/>
+      <w:lvlText w:val="o"/>
+      <w:lvlJc w:val="left"/>
+      <w:pPr>
+        <w:ind w:left="3600" w:hanging="360"/>
+      </w:pPr>
+      <w:rPr>
+        <w:rFonts w:ascii="Courier New" w:hAnsi="Courier New" w:cs="Courier New" w:hint="default"/>
+      </w:rPr>
+    </w:lvl>
+    <w:lvl w:ilvl="5" w:tplc="04090005" w:tentative="1">
+      <w:start w:val="1"/>
+      <w:numFmt w:val="bullet"/>
+      <w:lvlText w:val=""/>
+      <w:lvlJc w:val="left"/>
+      <w:pPr>
+        <w:ind w:left="4320" w:hanging="360"/>
+      </w:pPr>
+      <w:rPr>
+        <w:rFonts w:ascii="Wingdings" w:hAnsi="Wingdings" w:hint="default"/>
+      </w:rPr>
+    </w:lvl>
+    <w:lvl w:ilvl="6" w:tplc="04090001" w:tentative="1">
+      <w:start w:val="1"/>
+      <w:numFmt w:val="bullet"/>
+      <w:lvlText w:val=""/>
+      <w:lvlJc w:val="left"/>
+      <w:pPr>
+        <w:ind w:left="5040" w:hanging="360"/>
+      </w:pPr>
+      <w:rPr>
+        <w:rFonts w:ascii="Symbol" w:hAnsi="Symbol" w:hint="default"/>
+      </w:rPr>
+    </w:lvl>
+    <w:lvl w:ilvl="7" w:tplc="04090003" w:tentative="1">
+      <w:start w:val="1"/>
+      <w:numFmt w:val="bullet"/>
+      <w:lvlText w:val="o"/>
+      <w:lvlJc w:val="left"/>
+      <w:pPr>
+        <w:ind w:left="5760" w:hanging="360"/>
+      </w:pPr>
+      <w:rPr>
+        <w:rFonts w:ascii="Courier New" w:hAnsi="Courier New" w:cs="Courier New" w:hint="default"/>
+      </w:rPr>
+    </w:lvl>
+    <w:lvl w:ilvl="8" w:tplc="04090005" w:tentative="1">
+      <w:start w:val="1"/>
+      <w:numFmt w:val="bullet"/>
+      <w:lvlText w:val=""/>
+      <w:lvlJc w:val="left"/>
+      <w:pPr>
+        <w:ind w:left="6480" w:hanging="360"/>
+      </w:pPr>
+      <w:rPr>
+        <w:rFonts w:ascii="Wingdings" w:hAnsi="Wingdings" w:hint="default"/>
+      </w:rPr>
+    </w:lvl>
+  </w:abstractNum>
   <w:num w:numId="1" w16cid:durableId="1796219010">
     <w:abstractNumId w:val="0"/>
+  </w:num>
+  <w:num w:numId="2" w16cid:durableId="713624582">
+    <w:abstractNumId w:val="1"/>
   </w:num>
 </w:numbering>
 </file>
@@ -2641,7 +2658,6 @@
   <w:style w:type="character" w:default="1" w:styleId="DefaultParagraphFont">
     <w:name w:val="Default Paragraph Font"/>
     <w:uiPriority w:val="1"/>
-    <w:semiHidden/>
     <w:unhideWhenUsed/>
   </w:style>
   <w:style w:type="table" w:default="1" w:styleId="TableNormal">

</xml_diff>

<commit_message>
added images, branched word with added vc to know which would go where and ui images
</commit_message>
<xml_diff>
--- a/Bremer Stadtmusikanten EN - Copy.docx
+++ b/Bremer Stadtmusikanten EN - Copy.docx
@@ -52,6 +52,26 @@
       </w:r>
     </w:p>
     <w:p>
+      <w:pPr>
+        <w:rPr>
+          <w:b/>
+          <w:bCs/>
+        </w:rPr>
+      </w:pPr>
+      <w:r>
+        <w:rPr>
+          <w:b/>
+          <w:bCs/>
+        </w:rPr>
+        <w:t>VC means voice line audio file that corresponds to the text</w:t>
+      </w:r>
+    </w:p>
+    <w:p>
+      <w:r>
+        <w:t>VC1:</w:t>
+      </w:r>
+    </w:p>
+    <w:p>
       <w:r>
         <w:t xml:space="preserve">A man had a donkey, who for long years had untiringly carried sacks to the mill, but whose strength was now failing, so that he was becoming less and less able to work. Then his master thought that he would no longer feed him, </w:t>
       </w:r>
@@ -119,6 +139,21 @@
           <w:b/>
           <w:bCs/>
         </w:rPr>
+        <w:t>VC 2:</w:t>
+      </w:r>
+    </w:p>
+    <w:p>
+      <w:pPr>
+        <w:rPr>
+          <w:b/>
+          <w:bCs/>
+        </w:rPr>
+      </w:pPr>
+      <w:r>
+        <w:rPr>
+          <w:b/>
+          <w:bCs/>
+        </w:rPr>
         <w:t>Option 1</w:t>
       </w:r>
       <w:r>
@@ -184,6 +219,21 @@
           <w:b/>
           <w:bCs/>
         </w:rPr>
+        <w:t>VC 3:</w:t>
+      </w:r>
+    </w:p>
+    <w:p>
+      <w:pPr>
+        <w:rPr>
+          <w:b/>
+          <w:bCs/>
+        </w:rPr>
+      </w:pPr>
+      <w:r>
+        <w:rPr>
+          <w:b/>
+          <w:bCs/>
+        </w:rPr>
         <w:t>Option 2</w:t>
       </w:r>
       <w:r>
@@ -278,6 +328,21 @@
           <w:b/>
           <w:bCs/>
         </w:rPr>
+        <w:t>VC 4:</w:t>
+      </w:r>
+    </w:p>
+    <w:p>
+      <w:pPr>
+        <w:rPr>
+          <w:b/>
+          <w:bCs/>
+        </w:rPr>
+      </w:pPr>
+      <w:r>
+        <w:rPr>
+          <w:b/>
+          <w:bCs/>
+        </w:rPr>
         <w:t>Option 3</w:t>
       </w:r>
       <w:r>
@@ -304,6 +369,7 @@
     </w:p>
     <w:p>
       <w:r>
+        <w:lastRenderedPageBreak/>
         <w:t xml:space="preserve">“ Well, </w:t>
       </w:r>
       <w:proofErr w:type="spellStart"/>
@@ -319,674 +385,803 @@
       </w:r>
       <w:r>
         <w:t>behind.</w:t>
+      </w:r>
+    </w:p>
+    <w:p>
+      <w:r>
+        <w:t>VC 5:</w:t>
+      </w:r>
+    </w:p>
+    <w:p>
+      <w:pPr>
+        <w:rPr>
+          <w:b/>
+          <w:bCs/>
+        </w:rPr>
+      </w:pPr>
+      <w:r>
+        <w:rPr>
+          <w:b/>
+          <w:bCs/>
+        </w:rPr>
+        <w:t>Option 3 Continuation:</w:t>
+      </w:r>
+    </w:p>
+    <w:p>
+      <w:r>
+        <w:t xml:space="preserve">It didn't take long, before </w:t>
+      </w:r>
+      <w:r>
+        <w:rPr>
+          <w:highlight w:val="yellow"/>
+        </w:rPr>
+        <w:t>the donkey</w:t>
+      </w:r>
+      <w:r>
+        <w:t xml:space="preserve"> came to a cat sitting by the side of the road and making a face like three days of rainy weather. "What has crossed you, old </w:t>
+      </w:r>
+      <w:r>
+        <w:t>Milk</w:t>
+      </w:r>
+      <w:r>
+        <w:t>-Licker?" said the donkey.</w:t>
+      </w:r>
+    </w:p>
+    <w:p>
+      <w:r>
+        <w:t xml:space="preserve">"Oh," answered the cat, "who can be cheerful when his neck is at risk? I am getting on in years, and my teeth are getting dull, so I would rather sit behind the stove and purr than to chase around after mice. </w:t>
+      </w:r>
+      <w:r>
+        <w:t>Therefore,</w:t>
+      </w:r>
+      <w:r>
+        <w:t xml:space="preserve"> my mistress wanted to drown me, but I took off. Now good advice is scarce. Where should I go?"</w:t>
+      </w:r>
+    </w:p>
+    <w:p>
+      <w:pPr>
+        <w:rPr>
+          <w:b/>
+          <w:bCs/>
+          <w:i/>
+          <w:iCs/>
+        </w:rPr>
+      </w:pPr>
+      <w:r>
+        <w:rPr>
+          <w:b/>
+          <w:bCs/>
+          <w:i/>
+          <w:iCs/>
+        </w:rPr>
+        <w:t>Continue to options 1.</w:t>
+      </w:r>
+      <w:r>
+        <w:rPr>
+          <w:b/>
+          <w:bCs/>
+          <w:i/>
+          <w:iCs/>
+        </w:rPr>
+        <w:t>2</w:t>
+      </w:r>
+      <w:r>
+        <w:rPr>
+          <w:b/>
+          <w:bCs/>
+          <w:i/>
+          <w:iCs/>
+        </w:rPr>
+        <w:t>, 2.</w:t>
+      </w:r>
+      <w:r>
+        <w:rPr>
+          <w:b/>
+          <w:bCs/>
+          <w:i/>
+          <w:iCs/>
+        </w:rPr>
+        <w:t>2</w:t>
+      </w:r>
+      <w:r>
+        <w:rPr>
+          <w:b/>
+          <w:bCs/>
+          <w:i/>
+          <w:iCs/>
+        </w:rPr>
+        <w:t>, 3.</w:t>
+      </w:r>
+      <w:r>
+        <w:rPr>
+          <w:b/>
+          <w:bCs/>
+          <w:i/>
+          <w:iCs/>
+        </w:rPr>
+        <w:t>2</w:t>
+      </w:r>
+    </w:p>
+    <w:p>
+      <w:pPr>
+        <w:rPr>
+          <w:b/>
+          <w:bCs/>
+        </w:rPr>
+      </w:pPr>
+      <w:r>
+        <w:rPr>
+          <w:b/>
+          <w:bCs/>
+        </w:rPr>
+        <w:t>VC 6:</w:t>
+      </w:r>
+    </w:p>
+    <w:p>
+      <w:pPr>
+        <w:rPr>
+          <w:b/>
+          <w:bCs/>
+        </w:rPr>
+      </w:pPr>
+      <w:r>
+        <w:rPr>
+          <w:b/>
+          <w:bCs/>
+        </w:rPr>
+        <w:t>Option 1 and 2 continuations:</w:t>
+      </w:r>
+    </w:p>
+    <w:p>
+      <w:r>
+        <w:t xml:space="preserve">It didn't take long, before </w:t>
+      </w:r>
+      <w:r>
+        <w:t xml:space="preserve">the </w:t>
+      </w:r>
+      <w:r>
+        <w:rPr>
+          <w:highlight w:val="yellow"/>
+        </w:rPr>
+        <w:t>donkey and the former hunting dog</w:t>
+      </w:r>
+      <w:r>
+        <w:t xml:space="preserve"> came to a cat sitting by the side of the road and making a face like three days of rainy weather. "What has crossed you, old </w:t>
+      </w:r>
+      <w:r>
+        <w:t>M</w:t>
+      </w:r>
+      <w:r>
+        <w:t>ilk</w:t>
+      </w:r>
+      <w:r>
+        <w:t>-Licker?" said the donkey.</w:t>
+      </w:r>
+    </w:p>
+    <w:p>
+      <w:r>
+        <w:t xml:space="preserve">"Oh," answered the cat, "who can be cheerful when his neck is at risk? I am getting on in years, and my teeth are getting dull, so I would rather sit behind the stove and purr than to chase around after mice. </w:t>
+      </w:r>
+      <w:r>
+        <w:t>Therefore,</w:t>
+      </w:r>
+      <w:r>
+        <w:t xml:space="preserve"> my mistress wanted to drown me, but I took off. Now good advice is scarce. Where should I go?"</w:t>
+      </w:r>
+    </w:p>
+    <w:p>
+      <w:pPr>
+        <w:rPr>
+          <w:b/>
+          <w:bCs/>
+        </w:rPr>
+      </w:pPr>
+      <w:r>
+        <w:rPr>
+          <w:b/>
+          <w:bCs/>
+        </w:rPr>
+        <w:t>VC 7:</w:t>
+      </w:r>
+    </w:p>
+    <w:p>
+      <w:pPr>
+        <w:rPr>
+          <w:b/>
+          <w:bCs/>
+        </w:rPr>
+      </w:pPr>
+      <w:r>
+        <w:rPr>
+          <w:b/>
+          <w:bCs/>
+        </w:rPr>
+        <w:t>Option 1</w:t>
+      </w:r>
+      <w:r>
+        <w:rPr>
+          <w:b/>
+          <w:bCs/>
+        </w:rPr>
+        <w:t>.</w:t>
+      </w:r>
+      <w:r>
+        <w:rPr>
+          <w:b/>
+          <w:bCs/>
+        </w:rPr>
+        <w:t>2</w:t>
+      </w:r>
+      <w:r>
+        <w:rPr>
+          <w:b/>
+          <w:bCs/>
+        </w:rPr>
+        <w:t xml:space="preserve"> (good):</w:t>
+      </w:r>
+      <w:r>
+        <w:rPr>
+          <w:b/>
+          <w:bCs/>
+        </w:rPr>
+        <w:t xml:space="preserve"> (</w:t>
+      </w:r>
+      <w:r>
+        <w:rPr>
+          <w:b/>
+          <w:bCs/>
+        </w:rPr>
+        <w:t>companion gained and having fun!</w:t>
+      </w:r>
+      <w:r>
+        <w:rPr>
+          <w:b/>
+          <w:bCs/>
+        </w:rPr>
+        <w:t>)</w:t>
+      </w:r>
+    </w:p>
+    <w:p>
+      <w:r>
+        <w:t>“Come along to Bremen! After all, you understand night music. You can become a town musician there and help draw an audience!” said the donkey excitedly. The cat was surprised by the cheerful invitation, but the thought of becoming a musician sounded much better than sitting alone and afraid. Convinced, the cat joined the donkey on his journey.</w:t>
+      </w:r>
+    </w:p>
+    <w:p>
+      <w:pPr>
+        <w:rPr>
+          <w:b/>
+          <w:bCs/>
+        </w:rPr>
+      </w:pPr>
+      <w:r>
+        <w:rPr>
+          <w:b/>
+          <w:bCs/>
+        </w:rPr>
+        <w:t>VC 8:</w:t>
+      </w:r>
+    </w:p>
+    <w:p>
+      <w:pPr>
+        <w:rPr>
+          <w:b/>
+          <w:bCs/>
+        </w:rPr>
+      </w:pPr>
+      <w:r>
+        <w:rPr>
+          <w:b/>
+          <w:bCs/>
+        </w:rPr>
+        <w:t>Option 2</w:t>
+      </w:r>
+      <w:r>
+        <w:rPr>
+          <w:b/>
+          <w:bCs/>
+        </w:rPr>
+        <w:t>.</w:t>
+      </w:r>
+      <w:r>
+        <w:rPr>
+          <w:b/>
+          <w:bCs/>
+        </w:rPr>
+        <w:t>2</w:t>
+      </w:r>
+      <w:r>
+        <w:rPr>
+          <w:b/>
+          <w:bCs/>
+        </w:rPr>
+        <w:t xml:space="preserve"> (neutral): </w:t>
+      </w:r>
+      <w:r>
+        <w:rPr>
+          <w:b/>
+          <w:bCs/>
+        </w:rPr>
+        <w:t>(</w:t>
+      </w:r>
+      <w:r>
+        <w:rPr>
+          <w:b/>
+          <w:bCs/>
+        </w:rPr>
+        <w:t>No companion gained</w:t>
+      </w:r>
+      <w:r>
+        <w:rPr>
+          <w:b/>
+          <w:bCs/>
+        </w:rPr>
+        <w:t>)</w:t>
+      </w:r>
+    </w:p>
+    <w:p>
+      <w:r>
+        <w:t>“</w:t>
+      </w:r>
+      <w:r>
+        <w:t xml:space="preserve"> Wouldn’t it be better to have one last hurray? In your old age.</w:t>
+      </w:r>
+      <w:r>
+        <w:t xml:space="preserve"> Come with </w:t>
+      </w:r>
+      <w:r>
+        <w:rPr>
+          <w:highlight w:val="yellow"/>
+        </w:rPr>
+        <w:t>us/me</w:t>
+      </w:r>
+      <w:r>
+        <w:t xml:space="preserve"> to Bremen, </w:t>
+      </w:r>
+      <w:proofErr w:type="spellStart"/>
+      <w:r>
+        <w:t>its</w:t>
+      </w:r>
+      <w:proofErr w:type="spellEnd"/>
+      <w:r>
+        <w:t xml:space="preserve"> better than staying here and waiting for your demise.” The donkey spouted. The cat was baffled by the mean words, they were true but mean. With a big huff and puff the cat decided </w:t>
+      </w:r>
+      <w:r>
+        <w:t>to turn around and sleep</w:t>
+      </w:r>
+      <w:r>
+        <w:t xml:space="preserve"> declining the offer</w:t>
+      </w:r>
+      <w:r>
+        <w:t xml:space="preserve">. </w:t>
+      </w:r>
+    </w:p>
+    <w:p>
+      <w:pPr>
+        <w:rPr>
+          <w:b/>
+          <w:bCs/>
+        </w:rPr>
+      </w:pPr>
+      <w:r>
+        <w:rPr>
+          <w:b/>
+          <w:bCs/>
+        </w:rPr>
+        <w:lastRenderedPageBreak/>
+        <w:t>VC 9:</w:t>
+      </w:r>
+    </w:p>
+    <w:p>
+      <w:pPr>
+        <w:rPr>
+          <w:b/>
+          <w:bCs/>
+        </w:rPr>
+      </w:pPr>
+      <w:r>
+        <w:rPr>
+          <w:b/>
+          <w:bCs/>
+        </w:rPr>
+        <w:t>Option 3.</w:t>
+      </w:r>
+      <w:r>
+        <w:rPr>
+          <w:b/>
+          <w:bCs/>
+        </w:rPr>
+        <w:t>2</w:t>
+      </w:r>
+      <w:r>
+        <w:rPr>
+          <w:b/>
+          <w:bCs/>
+        </w:rPr>
+        <w:t xml:space="preserve"> (Bad):</w:t>
+      </w:r>
+      <w:r>
+        <w:rPr>
+          <w:b/>
+          <w:bCs/>
+        </w:rPr>
+        <w:t xml:space="preserve"> (No companion joined donkey party in this option)</w:t>
+      </w:r>
+    </w:p>
+    <w:p>
+      <w:r>
+        <w:t xml:space="preserve">“Well you seem to be aging </w:t>
+      </w:r>
+      <w:r>
+        <w:t>alright;</w:t>
+      </w:r>
+      <w:r>
+        <w:t xml:space="preserve"> </w:t>
+      </w:r>
+      <w:r>
+        <w:t xml:space="preserve">I wanted to invite you to join </w:t>
+      </w:r>
+      <w:r>
+        <w:rPr>
+          <w:highlight w:val="yellow"/>
+        </w:rPr>
+        <w:t>us/me</w:t>
+      </w:r>
+      <w:r>
+        <w:t xml:space="preserve"> in our adventure to be musicians but clearly you can’t use your </w:t>
+      </w:r>
+      <w:r>
+        <w:t>muscles like you used to...” The donkey said in a joking manner, trying to get laughs but instead was met with a hiss from the cat so shrill and lethal</w:t>
+      </w:r>
+      <w:r>
+        <w:t>,</w:t>
+      </w:r>
+      <w:r>
+        <w:t xml:space="preserve"> it made the donkey flee and run along the path, far away from the cat. </w:t>
+      </w:r>
+    </w:p>
+    <w:p>
+      <w:r>
+        <w:t>VC 10:</w:t>
+      </w:r>
+    </w:p>
+    <w:p>
+      <w:pPr>
+        <w:rPr>
+          <w:b/>
+          <w:bCs/>
+        </w:rPr>
+      </w:pPr>
+      <w:r>
+        <w:rPr>
+          <w:b/>
+          <w:bCs/>
+        </w:rPr>
+        <w:t>Continuation of the options:</w:t>
+      </w:r>
+    </w:p>
+    <w:p>
+      <w:r>
+        <w:t>After travelling further along the road, the donkey and their companion came to a farmyard. They were tired from the day’s journey, but the donkey felt less alone with every new friend who had walked beside him. There, the rooster of the house was sitting on the gate, crying with all his might.</w:t>
+      </w:r>
+    </w:p>
+    <w:p>
+      <w:r>
+        <w:t>“Your cries pierce one’s marrow and bone,” said the donkey. “What are you up to?”</w:t>
+      </w:r>
+    </w:p>
+    <w:p>
+      <w:r>
+        <w:t>“I just prophesied good weather,” said the rooster, “because it is Our Dear Lady’s Day, when she washes the Christ Child’s shirts and wants to dry them; but because Sunday guests are coming tomorrow, the lady of the house has no mercy and told the cook that she wants to eat me tomorrow in the soup, so I am supposed to let them cut off my head this evening. Now I am going to cry at the top of my voice as long as I can.”</w:t>
+      </w:r>
+    </w:p>
+    <w:p>
+      <w:pPr>
+        <w:rPr>
+          <w:b/>
+          <w:bCs/>
+        </w:rPr>
+      </w:pPr>
+      <w:r>
+        <w:rPr>
+          <w:b/>
+          <w:bCs/>
+        </w:rPr>
+        <w:t>VC 11;</w:t>
+      </w:r>
+    </w:p>
+    <w:p>
+      <w:pPr>
+        <w:rPr>
+          <w:b/>
+          <w:bCs/>
+        </w:rPr>
+      </w:pPr>
+      <w:r>
+        <w:rPr>
+          <w:b/>
+          <w:bCs/>
+        </w:rPr>
+        <w:t>Option 1.3 (Good):</w:t>
+      </w:r>
+      <w:r>
+        <w:rPr>
+          <w:b/>
+          <w:bCs/>
+        </w:rPr>
+        <w:t xml:space="preserve"> (Companion gained)</w:t>
+      </w:r>
+    </w:p>
+    <w:p>
+      <w:r>
+        <w:t>“</w:t>
+      </w:r>
+      <w:r>
+        <w:t xml:space="preserve"> Hey now my fellow friend! That sounds tragic! My party and me are headed </w:t>
+      </w:r>
+      <w:proofErr w:type="spellStart"/>
+      <w:r>
+        <w:t>of</w:t>
+      </w:r>
+      <w:proofErr w:type="spellEnd"/>
+      <w:r>
+        <w:t xml:space="preserve"> to the city to become musicians! Why not join us and amaze the crowds with your beautiful voice?” Said the donkey excitedly. </w:t>
+      </w:r>
+      <w:r>
+        <w:t>The rooster was happy with the proposal, and all four went off together.</w:t>
+      </w:r>
+    </w:p>
+    <w:p>
+      <w:pPr>
+        <w:rPr>
+          <w:b/>
+          <w:bCs/>
+        </w:rPr>
+      </w:pPr>
+      <w:r>
+        <w:rPr>
+          <w:b/>
+          <w:bCs/>
+        </w:rPr>
+        <w:t>VC 12:</w:t>
+      </w:r>
+    </w:p>
+    <w:p>
+      <w:pPr>
+        <w:rPr>
+          <w:b/>
+          <w:bCs/>
+        </w:rPr>
+      </w:pPr>
+      <w:r>
+        <w:rPr>
+          <w:b/>
+          <w:bCs/>
+        </w:rPr>
+        <w:t xml:space="preserve">Option </w:t>
+      </w:r>
+      <w:r>
+        <w:rPr>
+          <w:b/>
+          <w:bCs/>
+        </w:rPr>
+        <w:t>2</w:t>
+      </w:r>
+      <w:r>
+        <w:rPr>
+          <w:b/>
+          <w:bCs/>
+        </w:rPr>
+        <w:t>.3</w:t>
+      </w:r>
+      <w:r>
+        <w:rPr>
+          <w:b/>
+          <w:bCs/>
+        </w:rPr>
+        <w:t>(</w:t>
+      </w:r>
+      <w:r>
+        <w:rPr>
+          <w:b/>
+          <w:bCs/>
+        </w:rPr>
+        <w:t>Neutral</w:t>
+      </w:r>
+      <w:r>
+        <w:rPr>
+          <w:b/>
+          <w:bCs/>
+        </w:rPr>
+        <w:t>)</w:t>
+      </w:r>
+      <w:r>
+        <w:rPr>
+          <w:b/>
+          <w:bCs/>
+        </w:rPr>
+        <w:t>:</w:t>
+      </w:r>
+      <w:r>
+        <w:rPr>
+          <w:b/>
+          <w:bCs/>
+        </w:rPr>
+        <w:t xml:space="preserve"> </w:t>
+      </w:r>
+      <w:r>
+        <w:rPr>
+          <w:b/>
+          <w:bCs/>
+        </w:rPr>
+        <w:t>(Companion gained)</w:t>
+      </w:r>
+    </w:p>
+    <w:p>
+      <w:r>
+        <w:t>"Hey now, Red-Head," said the donkey, "instead come away with us. We're going to Bremen. You can always find something better than death. You have a good voice, and when we make music together, it will be very pleasing."</w:t>
+      </w:r>
+      <w:r>
+        <w:t xml:space="preserve"> Mentioned the Donkey sheepishly. </w:t>
+      </w:r>
+      <w:r>
+        <w:t xml:space="preserve">The rooster was taken aback by the straight forwardness but agreed nonetheless. </w:t>
+      </w:r>
+    </w:p>
+    <w:p>
+      <w:pPr>
+        <w:rPr>
+          <w:b/>
+          <w:bCs/>
+        </w:rPr>
+      </w:pPr>
+      <w:r>
+        <w:rPr>
+          <w:b/>
+          <w:bCs/>
+        </w:rPr>
+        <w:t>VC 13:</w:t>
+      </w:r>
+    </w:p>
+    <w:p>
+      <w:pPr>
+        <w:rPr>
+          <w:b/>
+          <w:bCs/>
+        </w:rPr>
+      </w:pPr>
+      <w:r>
+        <w:rPr>
+          <w:b/>
+          <w:bCs/>
+        </w:rPr>
+        <w:t xml:space="preserve">Option 3.3(Bad): </w:t>
+      </w:r>
+      <w:r>
+        <w:rPr>
+          <w:b/>
+          <w:bCs/>
+        </w:rPr>
+        <w:t>(</w:t>
+      </w:r>
+      <w:r>
+        <w:rPr>
+          <w:b/>
+          <w:bCs/>
+        </w:rPr>
+        <w:t>No companion gained</w:t>
+      </w:r>
+      <w:r>
+        <w:rPr>
+          <w:b/>
+          <w:bCs/>
+        </w:rPr>
+        <w:t>)</w:t>
+      </w:r>
+    </w:p>
+    <w:p>
+      <w:r>
+        <w:lastRenderedPageBreak/>
+        <w:t xml:space="preserve">“ Well that does sound bad but </w:t>
+      </w:r>
+      <w:r>
+        <w:t>with your shrill voice, do you believe you’ll make a difference if you make noises all evening long? Better come with us, might as well put your voice to good use</w:t>
+      </w:r>
+      <w:r>
+        <w:t xml:space="preserve">.” The donkey snorted. </w:t>
+      </w:r>
+      <w:r>
+        <w:t xml:space="preserve">The rooster was appalled and continued with the noise making, </w:t>
+      </w:r>
+      <w:r>
+        <w:t>being louder than before. The donkey lowered their head in shame and walked on</w:t>
+      </w:r>
+      <w:r>
+        <w:t xml:space="preserve"> towards the city</w:t>
+      </w:r>
+      <w:r>
+        <w:t>, regretting their choice of words.</w:t>
+      </w:r>
+    </w:p>
+    <w:p>
+      <w:pPr>
+        <w:rPr>
+          <w:b/>
+          <w:bCs/>
+        </w:rPr>
+      </w:pPr>
+      <w:r>
+        <w:rPr>
+          <w:b/>
+          <w:bCs/>
+        </w:rPr>
+        <w:t>VC 14:</w:t>
+      </w:r>
+    </w:p>
+    <w:p>
+      <w:pPr>
+        <w:rPr>
+          <w:b/>
+          <w:bCs/>
+        </w:rPr>
+      </w:pPr>
+      <w:r>
+        <w:rPr>
+          <w:b/>
+          <w:bCs/>
+        </w:rPr>
+        <w:t xml:space="preserve">Continuation from </w:t>
+      </w:r>
+      <w:r>
+        <w:rPr>
+          <w:b/>
+          <w:bCs/>
+        </w:rPr>
+        <w:t xml:space="preserve">all </w:t>
+      </w:r>
+      <w:r>
+        <w:rPr>
+          <w:b/>
+          <w:bCs/>
+        </w:rPr>
+        <w:t xml:space="preserve">options: </w:t>
+      </w:r>
+    </w:p>
+    <w:p>
+      <w:r>
+        <w:t xml:space="preserve">However, the donkey </w:t>
+      </w:r>
+      <w:r>
+        <w:rPr>
+          <w:highlight w:val="yellow"/>
+        </w:rPr>
+        <w:t>and his companions</w:t>
+      </w:r>
+      <w:r>
+        <w:t>, could not reach the city of Bremen in one day. In the evening, they came into a forest, where they decided to spend the night</w:t>
+      </w:r>
+      <w:r>
+        <w:t xml:space="preserve">. </w:t>
       </w:r>
     </w:p>
     <w:p/>
     <w:p/>
-    <w:p/>
-    <w:p>
-      <w:pPr>
-        <w:rPr>
-          <w:b/>
-          <w:bCs/>
-        </w:rPr>
-      </w:pPr>
-      <w:r>
-        <w:rPr>
-          <w:b/>
-          <w:bCs/>
-        </w:rPr>
-        <w:lastRenderedPageBreak/>
-        <w:t>Option 3 Continuation:</w:t>
-      </w:r>
-    </w:p>
-    <w:p>
-      <w:r>
-        <w:t xml:space="preserve">It didn't take long, before </w:t>
-      </w:r>
-      <w:r>
-        <w:rPr>
-          <w:highlight w:val="yellow"/>
-        </w:rPr>
-        <w:t>the donkey</w:t>
-      </w:r>
-      <w:r>
-        <w:t xml:space="preserve"> came to a cat sitting by the side of the road and making a face like three days of rainy weather. "What has crossed you, old </w:t>
-      </w:r>
-      <w:r>
-        <w:t>Milk</w:t>
-      </w:r>
-      <w:r>
-        <w:t>-Licker?" said the donkey.</w:t>
-      </w:r>
-    </w:p>
-    <w:p>
-      <w:r>
-        <w:t xml:space="preserve">"Oh," answered the cat, "who can be cheerful when his neck is at risk? I am getting on in years, and my teeth are getting dull, so I would rather sit behind the stove and purr than to chase around after mice. </w:t>
-      </w:r>
-      <w:r>
-        <w:t>Therefore,</w:t>
-      </w:r>
-      <w:r>
-        <w:t xml:space="preserve"> my mistress wanted to drown me, but I took off. Now good advice is scarce. Where should I go?"</w:t>
-      </w:r>
-    </w:p>
-    <w:p>
-      <w:pPr>
-        <w:rPr>
-          <w:b/>
-          <w:bCs/>
-          <w:i/>
-          <w:iCs/>
-        </w:rPr>
-      </w:pPr>
-      <w:r>
-        <w:rPr>
-          <w:b/>
-          <w:bCs/>
-          <w:i/>
-          <w:iCs/>
-        </w:rPr>
-        <w:t>Continue to options 1.</w:t>
-      </w:r>
-      <w:r>
-        <w:rPr>
-          <w:b/>
-          <w:bCs/>
-          <w:i/>
-          <w:iCs/>
-        </w:rPr>
-        <w:t>2</w:t>
-      </w:r>
-      <w:r>
-        <w:rPr>
-          <w:b/>
-          <w:bCs/>
-          <w:i/>
-          <w:iCs/>
-        </w:rPr>
-        <w:t>, 2.</w:t>
-      </w:r>
-      <w:r>
-        <w:rPr>
-          <w:b/>
-          <w:bCs/>
-          <w:i/>
-          <w:iCs/>
-        </w:rPr>
-        <w:t>2</w:t>
-      </w:r>
-      <w:r>
-        <w:rPr>
-          <w:b/>
-          <w:bCs/>
-          <w:i/>
-          <w:iCs/>
-        </w:rPr>
-        <w:t>, 3.</w:t>
-      </w:r>
-      <w:r>
-        <w:rPr>
-          <w:b/>
-          <w:bCs/>
-          <w:i/>
-          <w:iCs/>
-        </w:rPr>
-        <w:t>2</w:t>
-      </w:r>
-    </w:p>
-    <w:p>
-      <w:pPr>
-        <w:rPr>
-          <w:b/>
-          <w:bCs/>
-        </w:rPr>
-      </w:pPr>
-      <w:r>
-        <w:rPr>
-          <w:b/>
-          <w:bCs/>
-        </w:rPr>
-        <w:t>Option 1 and 2 continuations:</w:t>
-      </w:r>
-    </w:p>
-    <w:p>
-      <w:r>
-        <w:t xml:space="preserve">It didn't take long, before </w:t>
-      </w:r>
-      <w:r>
-        <w:t xml:space="preserve">the </w:t>
-      </w:r>
-      <w:r>
-        <w:rPr>
-          <w:highlight w:val="yellow"/>
-        </w:rPr>
-        <w:t>donkey and the former hunting dog</w:t>
-      </w:r>
-      <w:r>
-        <w:t xml:space="preserve"> came to a cat sitting by the side of the road and making a face like three days of rainy weather. "What has crossed you, old </w:t>
-      </w:r>
-      <w:r>
-        <w:t>M</w:t>
-      </w:r>
-      <w:r>
-        <w:t>ilk</w:t>
-      </w:r>
-      <w:r>
-        <w:t>-Licker?" said the donkey.</w:t>
-      </w:r>
-    </w:p>
-    <w:p>
-      <w:r>
-        <w:t xml:space="preserve">"Oh," answered the cat, "who can be cheerful when his neck is at risk? I am getting on in years, and my teeth are getting dull, so I would rather sit behind the stove and purr than to chase around after mice. </w:t>
-      </w:r>
-      <w:r>
-        <w:t>Therefore,</w:t>
-      </w:r>
-      <w:r>
-        <w:t xml:space="preserve"> my mistress wanted to drown me, but I took off. Now good advice is scarce. Where should I go?"</w:t>
-      </w:r>
-    </w:p>
-    <w:p>
-      <w:pPr>
-        <w:rPr>
-          <w:b/>
-          <w:bCs/>
-        </w:rPr>
-      </w:pPr>
-      <w:r>
-        <w:rPr>
-          <w:b/>
-          <w:bCs/>
-        </w:rPr>
-        <w:t>Option 1</w:t>
-      </w:r>
-      <w:r>
-        <w:rPr>
-          <w:b/>
-          <w:bCs/>
-        </w:rPr>
-        <w:t>.</w:t>
-      </w:r>
-      <w:r>
-        <w:rPr>
-          <w:b/>
-          <w:bCs/>
-        </w:rPr>
-        <w:t>2</w:t>
-      </w:r>
-      <w:r>
-        <w:rPr>
-          <w:b/>
-          <w:bCs/>
-        </w:rPr>
-        <w:t xml:space="preserve"> (good):</w:t>
-      </w:r>
-      <w:r>
-        <w:rPr>
-          <w:b/>
-          <w:bCs/>
-        </w:rPr>
-        <w:t xml:space="preserve"> (</w:t>
-      </w:r>
-      <w:r>
-        <w:rPr>
-          <w:b/>
-          <w:bCs/>
-        </w:rPr>
-        <w:t>companion gained and having fun!</w:t>
-      </w:r>
-      <w:r>
-        <w:rPr>
-          <w:b/>
-          <w:bCs/>
-        </w:rPr>
-        <w:t>)</w:t>
-      </w:r>
-    </w:p>
-    <w:p>
-      <w:r>
-        <w:t>“Come along to Bremen! After all, you understand night music. You can become a town musician there and help draw an audience!” said the donkey excitedly. The cat was surprised by the cheerful invitation, but the thought of becoming a musician sounded much better than sitting alone and afraid. Convinced, the cat joined the donkey on his journey.</w:t>
-      </w:r>
-    </w:p>
-    <w:p>
-      <w:pPr>
-        <w:rPr>
-          <w:b/>
-          <w:bCs/>
-        </w:rPr>
-      </w:pPr>
-      <w:r>
-        <w:rPr>
-          <w:b/>
-          <w:bCs/>
-        </w:rPr>
-        <w:t>Option 2</w:t>
-      </w:r>
-      <w:r>
-        <w:rPr>
-          <w:b/>
-          <w:bCs/>
-        </w:rPr>
-        <w:t>.</w:t>
-      </w:r>
-      <w:r>
-        <w:rPr>
-          <w:b/>
-          <w:bCs/>
-        </w:rPr>
-        <w:t>2</w:t>
-      </w:r>
-      <w:r>
-        <w:rPr>
-          <w:b/>
-          <w:bCs/>
-        </w:rPr>
-        <w:t xml:space="preserve"> (neutral): </w:t>
-      </w:r>
-      <w:r>
-        <w:rPr>
-          <w:b/>
-          <w:bCs/>
-        </w:rPr>
-        <w:t>(</w:t>
-      </w:r>
-      <w:r>
-        <w:rPr>
-          <w:b/>
-          <w:bCs/>
-        </w:rPr>
-        <w:t>No companion gained</w:t>
-      </w:r>
-      <w:r>
-        <w:rPr>
-          <w:b/>
-          <w:bCs/>
-        </w:rPr>
-        <w:t>)</w:t>
-      </w:r>
-    </w:p>
-    <w:p>
-      <w:r>
-        <w:t>“</w:t>
-      </w:r>
-      <w:r>
-        <w:t xml:space="preserve"> Wouldn’t it be better to have one last hurray? In your old age.</w:t>
-      </w:r>
-      <w:r>
-        <w:t xml:space="preserve"> Come with </w:t>
-      </w:r>
-      <w:r>
-        <w:rPr>
-          <w:highlight w:val="yellow"/>
-        </w:rPr>
-        <w:t>us/me</w:t>
-      </w:r>
-      <w:r>
-        <w:t xml:space="preserve"> to Bremen, </w:t>
-      </w:r>
-      <w:proofErr w:type="spellStart"/>
-      <w:r>
-        <w:t>its</w:t>
-      </w:r>
-      <w:proofErr w:type="spellEnd"/>
-      <w:r>
-        <w:t xml:space="preserve"> better than staying here and waiting for your demise.” The donkey spouted. The cat was baffled by the mean words, they were true but mean. With a big huff and puff the cat decided </w:t>
-      </w:r>
-      <w:r>
-        <w:t>to turn around and sleep</w:t>
-      </w:r>
-      <w:r>
-        <w:t xml:space="preserve"> declining the offer</w:t>
-      </w:r>
-      <w:r>
-        <w:t xml:space="preserve">. </w:t>
-      </w:r>
-    </w:p>
-    <w:p>
-      <w:pPr>
-        <w:rPr>
-          <w:b/>
-          <w:bCs/>
-        </w:rPr>
-      </w:pPr>
-      <w:r>
-        <w:rPr>
-          <w:b/>
-          <w:bCs/>
-        </w:rPr>
-        <w:t>Option 3.</w:t>
-      </w:r>
-      <w:r>
-        <w:rPr>
-          <w:b/>
-          <w:bCs/>
-        </w:rPr>
-        <w:t>2</w:t>
-      </w:r>
-      <w:r>
-        <w:rPr>
-          <w:b/>
-          <w:bCs/>
-        </w:rPr>
-        <w:t xml:space="preserve"> (Bad):</w:t>
-      </w:r>
-      <w:r>
-        <w:rPr>
-          <w:b/>
-          <w:bCs/>
-        </w:rPr>
-        <w:t xml:space="preserve"> (No companion joined donkey party in this option)</w:t>
-      </w:r>
-    </w:p>
-    <w:p>
-      <w:r>
-        <w:t xml:space="preserve">“Well you seem to be aging alright, </w:t>
-      </w:r>
-      <w:r>
-        <w:t xml:space="preserve">I wanted to invite you to join </w:t>
-      </w:r>
-      <w:r>
-        <w:rPr>
-          <w:highlight w:val="yellow"/>
-        </w:rPr>
-        <w:t>us/me</w:t>
-      </w:r>
-      <w:r>
-        <w:t xml:space="preserve"> in our adventure to be musicians but clearly you can’t use your </w:t>
-      </w:r>
-      <w:r>
-        <w:t>muscles like you used to...” The donkey said in a joking manner, trying to get laughs but instead was met with a hiss from the cat so shrill and lethal</w:t>
-      </w:r>
-      <w:r>
-        <w:t>,</w:t>
-      </w:r>
-      <w:r>
-        <w:t xml:space="preserve"> it made the donkey flee and run along the path, far away from the cat. </w:t>
-      </w:r>
-    </w:p>
-    <w:p/>
-    <w:p>
-      <w:pPr>
-        <w:rPr>
-          <w:b/>
-          <w:bCs/>
-        </w:rPr>
-      </w:pPr>
-      <w:r>
-        <w:rPr>
-          <w:b/>
-          <w:bCs/>
-        </w:rPr>
-        <w:lastRenderedPageBreak/>
-        <w:t>Continuation of the options:</w:t>
-      </w:r>
-    </w:p>
-    <w:p>
-      <w:r>
-        <w:t xml:space="preserve">After travelling further along the road, the donkey and </w:t>
-      </w:r>
-      <w:r>
-        <w:t>their</w:t>
-      </w:r>
-      <w:r>
-        <w:t xml:space="preserve"> companion came to a farmyard. They were tired from the day’s journey, but the donkey felt less alone with every new friend who had walked beside him. There, the rooster of the house was sitting on the gate, crying with all his might.</w:t>
-      </w:r>
-    </w:p>
-    <w:p>
-      <w:r>
-        <w:t>“Your cries pierce one’s marrow and bone,” said the donkey. “What are you up to?”</w:t>
-      </w:r>
-    </w:p>
-    <w:p>
-      <w:r>
-        <w:t>“I just prophesied good weather,” said the rooster, “because it is Our Dear Lady’s Day, when she washes the Christ Child’s shirts and wants to dry them; but because Sunday guests are coming tomorrow, the lady of the house has no mercy and told the cook that she wants to eat me tomorrow in the soup, so I am supposed to let them cut off my head this evening. Now I am going to cry at the top of my voice as long as I can.”</w:t>
-      </w:r>
-    </w:p>
-    <w:p>
-      <w:pPr>
-        <w:rPr>
-          <w:b/>
-          <w:bCs/>
-        </w:rPr>
-      </w:pPr>
-      <w:r>
-        <w:rPr>
-          <w:b/>
-          <w:bCs/>
-        </w:rPr>
-        <w:t>Option 1.3 (Good):</w:t>
-      </w:r>
-      <w:r>
-        <w:rPr>
-          <w:b/>
-          <w:bCs/>
-        </w:rPr>
-        <w:t xml:space="preserve"> (Companion gained)</w:t>
-      </w:r>
-    </w:p>
-    <w:p>
-      <w:r>
-        <w:t>“</w:t>
-      </w:r>
-      <w:r>
-        <w:t xml:space="preserve"> Hey now my fellow friend! That sounds tragic! My party and me are headed </w:t>
-      </w:r>
-      <w:proofErr w:type="spellStart"/>
-      <w:r>
-        <w:t>of</w:t>
-      </w:r>
-      <w:proofErr w:type="spellEnd"/>
-      <w:r>
-        <w:t xml:space="preserve"> to the city to become musicians! Why not join us and amaze the crowds with your beautiful voice?” Said the donkey excitedly. </w:t>
-      </w:r>
-      <w:r>
-        <w:t>The rooster was happy with the proposal, and all four went off together.</w:t>
-      </w:r>
-    </w:p>
-    <w:p>
-      <w:pPr>
-        <w:rPr>
-          <w:b/>
-          <w:bCs/>
-        </w:rPr>
-      </w:pPr>
-      <w:r>
-        <w:rPr>
-          <w:b/>
-          <w:bCs/>
-        </w:rPr>
-        <w:t xml:space="preserve">Option </w:t>
-      </w:r>
-      <w:r>
-        <w:rPr>
-          <w:b/>
-          <w:bCs/>
-        </w:rPr>
-        <w:t>2</w:t>
-      </w:r>
-      <w:r>
-        <w:rPr>
-          <w:b/>
-          <w:bCs/>
-        </w:rPr>
-        <w:t>.3</w:t>
-      </w:r>
-      <w:r>
-        <w:rPr>
-          <w:b/>
-          <w:bCs/>
-        </w:rPr>
-        <w:t>(</w:t>
-      </w:r>
-      <w:r>
-        <w:rPr>
-          <w:b/>
-          <w:bCs/>
-        </w:rPr>
-        <w:t>Neutral</w:t>
-      </w:r>
-      <w:r>
-        <w:rPr>
-          <w:b/>
-          <w:bCs/>
-        </w:rPr>
-        <w:t>)</w:t>
-      </w:r>
-      <w:r>
-        <w:rPr>
-          <w:b/>
-          <w:bCs/>
-        </w:rPr>
-        <w:t>:</w:t>
-      </w:r>
-      <w:r>
-        <w:rPr>
-          <w:b/>
-          <w:bCs/>
-        </w:rPr>
-        <w:t xml:space="preserve"> </w:t>
-      </w:r>
-      <w:r>
-        <w:rPr>
-          <w:b/>
-          <w:bCs/>
-        </w:rPr>
-        <w:t>(Companion gained)</w:t>
-      </w:r>
-    </w:p>
-    <w:p>
-      <w:r>
-        <w:t>"Hey now, Red-Head," said the donkey, "instead come away with us. We're going to Bremen. You can always find something better than death. You have a good voice, and when we make music together, it will be very pleasing."</w:t>
-      </w:r>
-      <w:r>
-        <w:t xml:space="preserve"> Mentioned the Donkey sheepishly. </w:t>
-      </w:r>
-      <w:r>
-        <w:t xml:space="preserve">The rooster was taken aback by the straight forwardness but agreed nonetheless. </w:t>
-      </w:r>
-    </w:p>
-    <w:p>
-      <w:pPr>
-        <w:rPr>
-          <w:b/>
-          <w:bCs/>
-        </w:rPr>
-      </w:pPr>
-      <w:r>
-        <w:rPr>
-          <w:b/>
-          <w:bCs/>
-        </w:rPr>
-        <w:t xml:space="preserve">Option 3.3(Bad): </w:t>
-      </w:r>
-      <w:r>
-        <w:rPr>
-          <w:b/>
-          <w:bCs/>
-        </w:rPr>
-        <w:t>(</w:t>
-      </w:r>
-      <w:r>
-        <w:rPr>
-          <w:b/>
-          <w:bCs/>
-        </w:rPr>
-        <w:t>No companion gained</w:t>
-      </w:r>
-      <w:r>
-        <w:rPr>
-          <w:b/>
-          <w:bCs/>
-        </w:rPr>
-        <w:t>)</w:t>
-      </w:r>
-    </w:p>
-    <w:p>
-      <w:r>
-        <w:t xml:space="preserve">“ Well that does sound bad but </w:t>
-      </w:r>
-      <w:r>
-        <w:t>with your shrill voice, do you believe you’ll make a difference if you make noises all evening long? Better come with us, might as well put your voice to good use</w:t>
-      </w:r>
-      <w:r>
-        <w:t xml:space="preserve">.” The donkey snorted. </w:t>
-      </w:r>
-      <w:r>
-        <w:t xml:space="preserve">The rooster was appalled and continued with the noise making, </w:t>
-      </w:r>
-      <w:r>
-        <w:t>being louder than before. The donkey lowered their head in shame and walked on</w:t>
-      </w:r>
-      <w:r>
-        <w:t xml:space="preserve"> towards the city</w:t>
-      </w:r>
-      <w:r>
-        <w:t>, regretting their choice of words.</w:t>
-      </w:r>
-    </w:p>
-    <w:p>
-      <w:pPr>
-        <w:rPr>
-          <w:b/>
-          <w:bCs/>
-        </w:rPr>
-      </w:pPr>
-      <w:r>
-        <w:rPr>
-          <w:b/>
-          <w:bCs/>
-        </w:rPr>
-        <w:t xml:space="preserve">Continuation from </w:t>
-      </w:r>
-      <w:r>
-        <w:rPr>
-          <w:b/>
-          <w:bCs/>
-        </w:rPr>
-        <w:t xml:space="preserve">all </w:t>
-      </w:r>
-      <w:r>
-        <w:rPr>
-          <w:b/>
-          <w:bCs/>
-        </w:rPr>
-        <w:t xml:space="preserve">options: </w:t>
-      </w:r>
-    </w:p>
-    <w:p>
-      <w:r>
-        <w:t xml:space="preserve">However, the donkey </w:t>
-      </w:r>
-      <w:r>
-        <w:rPr>
-          <w:highlight w:val="yellow"/>
-        </w:rPr>
-        <w:t>and his companions</w:t>
-      </w:r>
-      <w:r>
-        <w:t>, could not reach the city of Bremen in one day. In the evening, they came into a forest, where they decided to spend the night</w:t>
-      </w:r>
-      <w:r>
-        <w:t xml:space="preserve">. </w:t>
-      </w:r>
-    </w:p>
-    <w:p/>
-    <w:p/>
-    <w:p/>
-    <w:p>
-      <w:pPr>
-        <w:rPr>
-          <w:b/>
-          <w:bCs/>
-        </w:rPr>
-      </w:pPr>
-      <w:r>
-        <w:rPr>
-          <w:b/>
-          <w:bCs/>
-        </w:rPr>
-        <w:lastRenderedPageBreak/>
+    <w:p>
+      <w:r>
+        <w:t>VC 15 – End bad:</w:t>
+      </w:r>
+    </w:p>
+    <w:p>
+      <w:pPr>
+        <w:rPr>
+          <w:b/>
+          <w:bCs/>
+        </w:rPr>
+      </w:pPr>
+      <w:r>
+        <w:rPr>
+          <w:b/>
+          <w:bCs/>
+        </w:rPr>
         <w:t>__________________</w:t>
       </w:r>
       <w:r>
@@ -1052,6 +1247,21 @@
           <w:b/>
           <w:bCs/>
         </w:rPr>
+        <w:t>VC 16:</w:t>
+      </w:r>
+    </w:p>
+    <w:p>
+      <w:pPr>
+        <w:rPr>
+          <w:b/>
+          <w:bCs/>
+        </w:rPr>
+      </w:pPr>
+      <w:r>
+        <w:rPr>
+          <w:b/>
+          <w:bCs/>
+        </w:rPr>
         <w:t>- o</w:t>
       </w:r>
       <w:r>
@@ -1125,6 +1335,23 @@
           <w:bCs/>
           <w:highlight w:val="yellow"/>
         </w:rPr>
+        <w:t>VC 17:</w:t>
+      </w:r>
+    </w:p>
+    <w:p>
+      <w:pPr>
+        <w:rPr>
+          <w:b/>
+          <w:bCs/>
+          <w:highlight w:val="yellow"/>
+        </w:rPr>
+      </w:pPr>
+      <w:r>
+        <w:rPr>
+          <w:b/>
+          <w:bCs/>
+          <w:highlight w:val="yellow"/>
+        </w:rPr>
         <w:t>The tower game</w:t>
       </w:r>
       <w:r>
@@ -1157,7 +1384,11 @@
         <w:t>When they had done that, at a signal they began to make their music all together. The donkey brayed, the dog barked, the cat meowed and the rooster crowed. Then they crashed through the window into the room, shattering the panes.</w:t>
       </w:r>
     </w:p>
-    <w:p/>
+    <w:p>
+      <w:r>
+        <w:t>VC 18:</w:t>
+      </w:r>
+    </w:p>
     <w:p>
       <w:r>
         <w:t xml:space="preserve">The robbers jumped up at the terrible bellowing, thinking that a ghost was coming in, and fled in great fear out into the woods. Then the </w:t>
@@ -1171,6 +1402,7 @@
     </w:p>
     <w:p>
       <w:r>
+        <w:lastRenderedPageBreak/>
         <w:t xml:space="preserve">When the four minstrels were finished, they put out the light and looked for a place to sleep, each according to </w:t>
       </w:r>
       <w:r>
@@ -1189,243 +1421,300 @@
         <w:t>hay</w:t>
       </w:r>
       <w:r>
-        <w:t xml:space="preserve"> pile, the dog behind the door, the cat on the hearth next to the warm ashes, and the </w:t>
-      </w:r>
-      <w:r>
+        <w:t xml:space="preserve"> pile, the dog behind the door, the cat on the hearth next to the warm ashes, and the rooster sat on the beam of the roof. Because they were tired from their long journey, they soon fell asleep.</w:t>
+      </w:r>
+    </w:p>
+    <w:p>
+      <w:r>
+        <w:t>VC 19:</w:t>
+      </w:r>
+    </w:p>
+    <w:p>
+      <w:r>
+        <w:t xml:space="preserve">When midnight had passed and the robbers saw from the distance that the light was no longer burning in the house, and everything appeared to be quiet, the captain said, "We shouldn't have let ourselves be chased off," and he told one of them to go back and investigate the house. The one they sent found everything </w:t>
+      </w:r>
+      <w:r>
+        <w:t>still and</w:t>
+      </w:r>
+      <w:r>
+        <w:t xml:space="preserve"> went into the kitchen to strike a light.</w:t>
+      </w:r>
+    </w:p>
+    <w:p>
+      <w:pPr>
+        <w:rPr>
+          <w:b/>
+          <w:bCs/>
+        </w:rPr>
+      </w:pPr>
+      <w:r>
+        <w:rPr>
+          <w:b/>
+          <w:bCs/>
+        </w:rPr>
+        <w:t>VC 20: End Good</w:t>
+      </w:r>
+    </w:p>
+    <w:p>
+      <w:pPr>
+        <w:rPr>
+          <w:b/>
+          <w:bCs/>
+        </w:rPr>
+      </w:pPr>
+      <w:r>
+        <w:rPr>
+          <w:b/>
+          <w:bCs/>
+        </w:rPr>
+        <w:t>End - Good</w:t>
+      </w:r>
+      <w:r>
+        <w:rPr>
+          <w:b/>
+          <w:bCs/>
+        </w:rPr>
+        <w:t xml:space="preserve"> (</w:t>
+      </w:r>
+      <w:r>
+        <w:rPr>
+          <w:b/>
+          <w:bCs/>
+        </w:rPr>
+        <w:t>if dog, cat and rooster joined</w:t>
+      </w:r>
+      <w:r>
+        <w:rPr>
+          <w:b/>
+          <w:bCs/>
+        </w:rPr>
+        <w:t xml:space="preserve"> – good ending</w:t>
+      </w:r>
+      <w:r>
+        <w:rPr>
+          <w:b/>
+          <w:bCs/>
+        </w:rPr>
+        <w:t>)</w:t>
+      </w:r>
+    </w:p>
+    <w:p>
+      <w:r>
+        <w:t>He mistook the cat's glowing, fiery eyes for live coals, and held a sulfur match next to them, so that it would catch fire. But the cat didn't think this was funny and jumped into his face, spitting, and scratching.</w:t>
+      </w:r>
+    </w:p>
+    <w:p>
+      <w:r>
+        <w:t xml:space="preserve">He was terribly frightened and ran toward the back door, but the dog, who was lying there, jumped up and bit him in the leg. When he ran across the yard past the </w:t>
+      </w:r>
+      <w:r>
+        <w:t>hay</w:t>
+      </w:r>
+      <w:r>
+        <w:t xml:space="preserve"> pile, the donkey gave him a healthy blow with his hind foot, and the rooster, who had been awakened from his sleep by the noise and was now alert, cried down from the beam, "Cock-a-doodle-doo!"</w:t>
+      </w:r>
+    </w:p>
+    <w:p>
+      <w:pPr>
+        <w:rPr>
+          <w:b/>
+          <w:bCs/>
+        </w:rPr>
+      </w:pPr>
+      <w:r>
+        <w:rPr>
+          <w:b/>
+          <w:bCs/>
+        </w:rPr>
+        <w:t>VC 21:</w:t>
+      </w:r>
+    </w:p>
+    <w:p>
+      <w:pPr>
+        <w:rPr>
+          <w:b/>
+          <w:bCs/>
+        </w:rPr>
+      </w:pPr>
+      <w:r>
+        <w:rPr>
+          <w:b/>
+          <w:bCs/>
+        </w:rPr>
+        <w:t>Continuation good</w:t>
+      </w:r>
+      <w:r>
+        <w:rPr>
+          <w:b/>
+          <w:bCs/>
+        </w:rPr>
+        <w:t xml:space="preserve"> end</w:t>
+      </w:r>
+      <w:r>
+        <w:rPr>
+          <w:b/>
+          <w:bCs/>
+        </w:rPr>
+        <w:t>:</w:t>
+      </w:r>
+    </w:p>
+    <w:p>
+      <w:r>
+        <w:t xml:space="preserve">Then the robber ran as fast as he could back to his captain and said, "Oh, there is a horrible witch sitting in the house, she blew at me and scratched my face with her long </w:t>
+      </w:r>
+      <w:r>
+        <w:t>nails</w:t>
+      </w:r>
+      <w:r>
+        <w:t>. And there is a man with a knife standing in front of the door, and he stabbed me in the leg. And a black monster is lying in the yard, and it struck at me with a wooden club. And the judge is sitting up there on the roof, and he was calling out, 'Bring the rascal here.' Then I did what I could to get away."</w:t>
+      </w:r>
+    </w:p>
+    <w:p>
+      <w:r>
+        <w:t>From that time forth, the robbers did not dare go back into the house. However, the four Bremen Musicians liked it so well there, that they</w:t>
+      </w:r>
+      <w:r>
+        <w:t xml:space="preserve"> made that house their home, journeying on towards the city from time to time to play their music.</w:t>
+      </w:r>
+      <w:r>
+        <w:t xml:space="preserve"> </w:t>
+      </w:r>
+    </w:p>
+    <w:p>
+      <w:pPr>
+        <w:rPr>
+          <w:highlight w:val="yellow"/>
+        </w:rPr>
+      </w:pPr>
+      <w:r>
+        <w:rPr>
+          <w:highlight w:val="yellow"/>
+        </w:rPr>
+        <w:br w:type="page"/>
+      </w:r>
+    </w:p>
+    <w:p>
+      <w:pPr>
+        <w:rPr>
+          <w:b/>
+          <w:bCs/>
+        </w:rPr>
+      </w:pPr>
+      <w:r>
+        <w:rPr>
+          <w:b/>
+          <w:bCs/>
+        </w:rPr>
         <w:lastRenderedPageBreak/>
-        <w:t>rooster sat on the beam of the roof. Because they were tired from their long journey, they soon fell asleep.</w:t>
-      </w:r>
-    </w:p>
-    <w:p>
-      <w:r>
-        <w:t xml:space="preserve">When midnight had passed and the robbers saw from the distance that the light was no longer burning in the house, and everything appeared to be quiet, the captain said, "We shouldn't have let ourselves be chased off," and he told one of them to go back and investigate the house. The one they sent found everything </w:t>
-      </w:r>
-      <w:r>
-        <w:t>still and</w:t>
-      </w:r>
-      <w:r>
-        <w:t xml:space="preserve"> went into the kitchen to strike a light.</w:t>
-      </w:r>
-    </w:p>
-    <w:p>
-      <w:pPr>
-        <w:rPr>
-          <w:b/>
-          <w:bCs/>
-        </w:rPr>
-      </w:pPr>
-      <w:r>
-        <w:rPr>
-          <w:b/>
-          <w:bCs/>
-        </w:rPr>
-        <w:t>End - Good</w:t>
-      </w:r>
-      <w:r>
-        <w:rPr>
-          <w:b/>
-          <w:bCs/>
-        </w:rPr>
-        <w:t xml:space="preserve"> (</w:t>
-      </w:r>
-      <w:r>
-        <w:rPr>
-          <w:b/>
-          <w:bCs/>
-        </w:rPr>
-        <w:t>if dog, cat and rooster joined</w:t>
-      </w:r>
-      <w:r>
-        <w:rPr>
-          <w:b/>
-          <w:bCs/>
-        </w:rPr>
-        <w:t xml:space="preserve"> – good ending</w:t>
-      </w:r>
-      <w:r>
-        <w:rPr>
-          <w:b/>
-          <w:bCs/>
-        </w:rPr>
-        <w:t>)</w:t>
-      </w:r>
-    </w:p>
-    <w:p>
-      <w:r>
-        <w:t>He mistook the cat's glowing, fiery eyes for live coals, and held a sulfur match next to them, so that it would catch fire. But the cat didn't think this was funny and jumped into his face, spitting, and scratching.</w:t>
-      </w:r>
-    </w:p>
-    <w:p>
-      <w:r>
-        <w:t xml:space="preserve">He was terribly frightened and ran toward the back door, but the dog, who was lying there, jumped up and bit him in the leg. When he ran across the yard past the </w:t>
-      </w:r>
-      <w:r>
-        <w:t>hay</w:t>
-      </w:r>
-      <w:r>
-        <w:t xml:space="preserve"> pile, the donkey gave him a healthy blow with his hind foot, and the rooster, who had been awakened from his sleep by the noise and was now alert, cried down from the beam, "Cock-a-doodle-doo!"</w:t>
-      </w:r>
-    </w:p>
-    <w:p>
-      <w:pPr>
-        <w:rPr>
-          <w:b/>
-          <w:bCs/>
-        </w:rPr>
-      </w:pPr>
-      <w:r>
-        <w:rPr>
-          <w:b/>
-          <w:bCs/>
-        </w:rPr>
-        <w:t>Continuation good</w:t>
-      </w:r>
-      <w:r>
-        <w:rPr>
-          <w:b/>
-          <w:bCs/>
-        </w:rPr>
-        <w:t xml:space="preserve"> end</w:t>
-      </w:r>
-      <w:r>
-        <w:rPr>
-          <w:b/>
-          <w:bCs/>
-        </w:rPr>
-        <w:t>:</w:t>
-      </w:r>
-    </w:p>
-    <w:p>
-      <w:r>
-        <w:t xml:space="preserve">Then the robber ran as fast as he could back to his captain and said, "Oh, there is a horrible witch sitting in the house, she blew at me and scratched my face with her long </w:t>
-      </w:r>
-      <w:r>
-        <w:t>nails</w:t>
-      </w:r>
-      <w:r>
-        <w:t>. And there is a man with a knife standing in front of the door, and he stabbed me in the leg. And a black monster is lying in the yard, and it struck at me with a wooden club. And the judge is sitting up there on the roof, and he was calling out, 'Bring the rascal here.' Then I did what I could to get away."</w:t>
-      </w:r>
-    </w:p>
-    <w:p>
-      <w:r>
-        <w:t>From that time forth, the robbers did not dare go back into the house. However, the four Bremen Musicians liked it so well there, that they</w:t>
-      </w:r>
-      <w:r>
-        <w:t xml:space="preserve"> made that house their home, journeying on towards the city from time to time to play their music.</w:t>
-      </w:r>
-      <w:r>
-        <w:t xml:space="preserve"> </w:t>
-      </w:r>
-    </w:p>
-    <w:p>
-      <w:pPr>
-        <w:rPr>
+        <w:t>VC 22: End Neutral</w:t>
+      </w:r>
+    </w:p>
+    <w:p>
+      <w:pPr>
+        <w:rPr>
+          <w:b/>
+          <w:bCs/>
+        </w:rPr>
+      </w:pPr>
+      <w:r>
+        <w:rPr>
+          <w:b/>
+          <w:bCs/>
+        </w:rPr>
+        <w:t>___________</w:t>
+      </w:r>
+      <w:r>
+        <w:rPr>
+          <w:b/>
+          <w:bCs/>
+        </w:rPr>
+        <w:t>End</w:t>
+      </w:r>
+      <w:r>
+        <w:rPr>
+          <w:b/>
+          <w:bCs/>
+        </w:rPr>
+        <w:t xml:space="preserve"> – Neutral:</w:t>
+      </w:r>
+      <w:r>
+        <w:rPr>
+          <w:b/>
+          <w:bCs/>
+        </w:rPr>
+        <w:t xml:space="preserve"> (at least one more companion other than the donkey)</w:t>
+      </w:r>
+      <w:r>
+        <w:rPr>
+          <w:b/>
+          <w:bCs/>
+        </w:rPr>
+        <w:t>____</w:t>
+      </w:r>
+    </w:p>
+    <w:p>
+      <w:r>
+        <w:t>The donkey and his companion or companions settled down beneath a large tree in the forest. They had not gathered a complete band, but the donkey was no longer making the journey alone.</w:t>
+      </w:r>
+    </w:p>
+    <w:p>
+      <w:r>
+        <w:t>Before they could fall asleep, one of the animals noticed a little spark burning in the distance. It seemed that there must be a house nearby, for a light was shining through the darkness.</w:t>
+      </w:r>
+    </w:p>
+    <w:p>
+      <w:r>
+        <w:t>“Then we should go there,” said the donkey. “The lodging here is poor, and perhaps we may find something to eat.”</w:t>
+      </w:r>
+    </w:p>
+    <w:p>
+      <w:r>
+        <w:t>Tired and hungry, the small group set forth toward the light. It grew brighter and larger until they came to the front of a brightly lit robbers’ house.</w:t>
+      </w:r>
+    </w:p>
+    <w:p>
+      <w:r>
+        <w:t>The donkey, being the largest of them, approached the window and looked in.</w:t>
+      </w:r>
+    </w:p>
+    <w:p>
+      <w:r>
+        <w:t>“What do you see?” asked one of his companions.</w:t>
+      </w:r>
+    </w:p>
+    <w:p>
+      <w:r>
+        <w:t>“What do I see?” answered the donkey. “A table set with good things to eat and drink, and robbers sitting there enjoying themselves.”</w:t>
+      </w:r>
+    </w:p>
+    <w:p>
+      <w:r>
+        <w:t>“That would be something for us,” said his companion.</w:t>
+      </w:r>
+    </w:p>
+    <w:p>
+      <w:r>
+        <w:t>“Ee-ah, ee-ah, oh, if we were there!” said the donkey</w:t>
+      </w:r>
+      <w:r>
+        <w:t>.</w:t>
+      </w:r>
+    </w:p>
+    <w:p>
+      <w:pPr>
+        <w:rPr>
+          <w:b/>
+          <w:bCs/>
           <w:highlight w:val="yellow"/>
         </w:rPr>
       </w:pPr>
       <w:r>
         <w:rPr>
+          <w:b/>
+          <w:bCs/>
           <w:highlight w:val="yellow"/>
         </w:rPr>
-        <w:br w:type="page"/>
-      </w:r>
-    </w:p>
-    <w:p>
-      <w:pPr>
-        <w:rPr>
-          <w:b/>
-          <w:bCs/>
-        </w:rPr>
-      </w:pPr>
-      <w:r>
-        <w:rPr>
-          <w:b/>
-          <w:bCs/>
-        </w:rPr>
-        <w:lastRenderedPageBreak/>
-        <w:t>___________</w:t>
-      </w:r>
-      <w:r>
-        <w:rPr>
-          <w:b/>
-          <w:bCs/>
-        </w:rPr>
-        <w:t>End</w:t>
-      </w:r>
-      <w:r>
-        <w:rPr>
-          <w:b/>
-          <w:bCs/>
-        </w:rPr>
-        <w:t xml:space="preserve"> – Neutral:</w:t>
-      </w:r>
-      <w:r>
-        <w:rPr>
-          <w:b/>
-          <w:bCs/>
-        </w:rPr>
-        <w:t xml:space="preserve"> (at least one more companion other than the donkey)</w:t>
-      </w:r>
-      <w:r>
-        <w:rPr>
-          <w:b/>
-          <w:bCs/>
-        </w:rPr>
-        <w:t>____</w:t>
-      </w:r>
-    </w:p>
-    <w:p>
-      <w:r>
-        <w:t>The donkey and his companion or companions settled down beneath a large tree in the forest. They had not gathered a complete band, but the donkey was no longer making the journey alone.</w:t>
-      </w:r>
-    </w:p>
-    <w:p>
-      <w:r>
-        <w:t>Before they could fall asleep, one of the animals noticed a little spark burning in the distance. It seemed that there must be a house nearby, for a light was shining through the darkness.</w:t>
-      </w:r>
-    </w:p>
-    <w:p>
-      <w:r>
-        <w:t>“Then we should go there,” said the donkey. “The lodging here is poor, and perhaps we may find something to eat.”</w:t>
-      </w:r>
-    </w:p>
-    <w:p>
-      <w:r>
-        <w:t>Tired and hungry, the small group set forth toward the light. It grew brighter and larger until they came to the front of a brightly lit robbers’ house.</w:t>
-      </w:r>
-    </w:p>
-    <w:p>
-      <w:r>
-        <w:t>The donkey, being the largest of them, approached the window and looked in.</w:t>
-      </w:r>
-    </w:p>
-    <w:p>
-      <w:r>
-        <w:t xml:space="preserve">“What do you </w:t>
-      </w:r>
-      <w:r>
-        <w:t>s</w:t>
-      </w:r>
-      <w:r>
-        <w:t>ee?” asked one of his companions.</w:t>
-      </w:r>
-    </w:p>
-    <w:p>
-      <w:r>
-        <w:t>“What do I see?” answered the donkey. “A table set with good things to eat and drink, and robbers sitting there enjoying themselves.”</w:t>
-      </w:r>
-    </w:p>
-    <w:p>
-      <w:r>
-        <w:t>“That would be something for us,” said his companion.</w:t>
-      </w:r>
-    </w:p>
-    <w:p>
-      <w:r>
-        <w:t>“Ee-ah, ee-ah, oh, if we were there!” said the donkey</w:t>
-      </w:r>
-      <w:r>
-        <w:t>.</w:t>
+        <w:t>VC: 23</w:t>
       </w:r>
     </w:p>
     <w:p>
@@ -1551,13 +1840,17 @@
     </w:p>
     <w:p>
       <w:r>
+        <w:t>VC 24:</w:t>
+      </w:r>
+    </w:p>
+    <w:p>
+      <w:r>
         <w:t>At the donkey’s signal, they began their music together. The donkey brayed at the top of his lungs, while his companion or companions added their own cries to the dreadful concert. Then they crashed through the window into the room, shattering the panes.</w:t>
       </w:r>
     </w:p>
     <w:p/>
     <w:p>
       <w:r>
-        <w:lastRenderedPageBreak/>
         <w:t>The robbers jumped up at the terrible noise. In the confusion and darkness, they believed that some horrible creature had broken into their house, and they fled in great fear into the woods.</w:t>
       </w:r>
     </w:p>
@@ -1596,6 +1889,20 @@
         <w:rPr>
           <w:u w:val="single"/>
         </w:rPr>
+        <w:t xml:space="preserve">VC 25: </w:t>
+      </w:r>
+    </w:p>
+    <w:p>
+      <w:pPr>
+        <w:pStyle w:val="ListParagraph"/>
+        <w:rPr>
+          <w:u w:val="single"/>
+        </w:rPr>
+      </w:pPr>
+      <w:r>
+        <w:rPr>
+          <w:u w:val="single"/>
+        </w:rPr>
         <w:t>If the dog joined:</w:t>
       </w:r>
     </w:p>
@@ -1622,6 +1929,20 @@
         <w:rPr>
           <w:u w:val="single"/>
         </w:rPr>
+        <w:t>VC 26:</w:t>
+      </w:r>
+    </w:p>
+    <w:p>
+      <w:pPr>
+        <w:pStyle w:val="ListParagraph"/>
+        <w:rPr>
+          <w:u w:val="single"/>
+        </w:rPr>
+      </w:pPr>
+      <w:r>
+        <w:rPr>
+          <w:u w:val="single"/>
+        </w:rPr>
         <w:t>If the cat joined:</w:t>
       </w:r>
     </w:p>
@@ -1648,6 +1969,20 @@
         <w:rPr>
           <w:u w:val="single"/>
         </w:rPr>
+        <w:t>VC 27:</w:t>
+      </w:r>
+    </w:p>
+    <w:p>
+      <w:pPr>
+        <w:pStyle w:val="ListParagraph"/>
+        <w:rPr>
+          <w:u w:val="single"/>
+        </w:rPr>
+      </w:pPr>
+      <w:r>
+        <w:rPr>
+          <w:u w:val="single"/>
+        </w:rPr>
         <w:t>If the rooster joined:</w:t>
       </w:r>
     </w:p>
@@ -1666,6 +2001,29 @@
           <w:bCs/>
         </w:rPr>
       </w:pPr>
+    </w:p>
+    <w:p>
+      <w:pPr>
+        <w:rPr>
+          <w:b/>
+          <w:bCs/>
+        </w:rPr>
+      </w:pPr>
+      <w:r>
+        <w:rPr>
+          <w:b/>
+          <w:bCs/>
+        </w:rPr>
+        <w:t>VC28:</w:t>
+      </w:r>
+    </w:p>
+    <w:p>
+      <w:pPr>
+        <w:rPr>
+          <w:b/>
+          <w:bCs/>
+        </w:rPr>
+      </w:pPr>
       <w:r>
         <w:rPr>
           <w:b/>
@@ -1714,11 +2072,25 @@
         <w:rPr>
           <w:u w:val="single"/>
         </w:rPr>
+        <w:t>VC 29:</w:t>
+      </w:r>
+    </w:p>
+    <w:p>
+      <w:pPr>
+        <w:rPr>
+          <w:u w:val="single"/>
+        </w:rPr>
+      </w:pPr>
+      <w:r>
+        <w:rPr>
+          <w:u w:val="single"/>
+        </w:rPr>
         <w:t>If the cat joined:</w:t>
       </w:r>
     </w:p>
     <w:p>
       <w:r>
+        <w:lastRenderedPageBreak/>
         <w:t>In the kitchen, the robber mistook the cat’s glowing eyes for live coals and stepped closer to light his match. The cat sprang at his face, hissing and scratching until he stumbled backward in terror.</w:t>
       </w:r>
     </w:p>
@@ -1732,6 +2104,19 @@
         <w:rPr>
           <w:u w:val="single"/>
         </w:rPr>
+        <w:t>VC 30:</w:t>
+      </w:r>
+    </w:p>
+    <w:p>
+      <w:pPr>
+        <w:rPr>
+          <w:u w:val="single"/>
+        </w:rPr>
+      </w:pPr>
+      <w:r>
+        <w:rPr>
+          <w:u w:val="single"/>
+        </w:rPr>
         <w:t>If the dog joined:</w:t>
       </w:r>
     </w:p>
@@ -1750,6 +2135,19 @@
         <w:rPr>
           <w:u w:val="single"/>
         </w:rPr>
+        <w:t>VC 31:</w:t>
+      </w:r>
+    </w:p>
+    <w:p>
+      <w:pPr>
+        <w:rPr>
+          <w:u w:val="single"/>
+        </w:rPr>
+      </w:pPr>
+      <w:r>
+        <w:rPr>
+          <w:u w:val="single"/>
+        </w:rPr>
         <w:t>If the rooster joined:</w:t>
       </w:r>
     </w:p>
@@ -1760,14 +2158,17 @@
     </w:p>
     <w:p>
       <w:r>
-        <w:lastRenderedPageBreak/>
         <w:t>When the robber ran across the yard past the hay pile, the donkey gave him a powerful blow with his hind foot. Terrified and bruised, the robber fled as fast as he could back to his captain</w:t>
       </w:r>
       <w:r>
         <w:t>.</w:t>
       </w:r>
     </w:p>
-    <w:p/>
+    <w:p>
+      <w:r>
+        <w:t>VC 32:</w:t>
+      </w:r>
+    </w:p>
     <w:p>
       <w:r>
         <w:t>When the robber returned to his captain, he could barely speak from fear.</w:t>
@@ -1780,27 +2181,17 @@
     </w:p>
     <w:p>
       <w:r>
-        <w:t>From that time forth, the robbers did not dare go back into the house.</w:t>
-      </w:r>
-      <w:r>
-        <w:t xml:space="preserve"> The animals decided to make this their home and keep living there.</w:t>
-      </w:r>
-    </w:p>
-    <w:p>
-      <w:r>
-        <w:t xml:space="preserve">The donkey and his </w:t>
-      </w:r>
-      <w:r>
-        <w:t xml:space="preserve">band </w:t>
-      </w:r>
-      <w:r>
-        <w:t xml:space="preserve">were relieved to have found safety and shelter. </w:t>
-      </w:r>
-      <w:r>
-        <w:t>As</w:t>
-      </w:r>
-      <w:r>
-        <w:t xml:space="preserve"> the donkey looked at their small group, he could not help but think of the voices that were missing from their music. They had succeeded, but they were not yet the grand band he had dreamed of becoming.</w:t>
+        <w:t>VC 33:</w:t>
+      </w:r>
+    </w:p>
+    <w:p>
+      <w:r>
+        <w:t>From that time forth, the robbers did not dare go back into the house. The animals decided to make this their home and keep living there.</w:t>
+      </w:r>
+    </w:p>
+    <w:p>
+      <w:r>
+        <w:t>The donkey and his band were relieved to have found safety and shelter. As the donkey looked at their small group, he could not help but think of the voices that were missing from their music. They had succeeded, but they were not yet the grand band he had dreamed of becoming.</w:t>
       </w:r>
     </w:p>
     <w:p>
@@ -2658,6 +3049,7 @@
   <w:style w:type="character" w:default="1" w:styleId="DefaultParagraphFont">
     <w:name w:val="Default Paragraph Font"/>
     <w:uiPriority w:val="1"/>
+    <w:semiHidden/>
     <w:unhideWhenUsed/>
   </w:style>
   <w:style w:type="table" w:default="1" w:styleId="TableNormal">

</xml_diff>